<commit_message>
feat: update technical design documentation with team member details and content adjustments
</commit_message>
<xml_diff>
--- a/Project Diagrams & Documents/QueueWatch_SA_Technical_Design_Documentation.docx
+++ b/Project Diagrams & Documents/QueueWatch_SA_Technical_Design_Documentation.docx
@@ -57,7 +57,10 @@
         <w:t xml:space="preserve">Module: </w:t>
       </w:r>
       <w:r>
-        <w:t>DSW02A1 — Advanced Web Development</w:t>
+        <w:t xml:space="preserve">DSW02A1 — </w:t>
+      </w:r>
+      <w:r>
+        <w:t>Development Software</w:t>
       </w:r>
       <w:r>
         <w:br/>
@@ -69,7 +72,7 @@
         <w:t xml:space="preserve">Institution: </w:t>
       </w:r>
       <w:r>
-        <w:t>University of Johannesburg (UJ)</w:t>
+        <w:t>University of Johannesburg</w:t>
       </w:r>
       <w:r>
         <w:br/>
@@ -81,10 +84,25 @@
         <w:t xml:space="preserve">Development Squad: </w:t>
       </w:r>
       <w:r>
-        <w:t>Dev Squad (DSW02A1, Team 2)</w:t>
+        <w:t xml:space="preserve">Dev Squad (DSW02A1, </w:t>
+      </w:r>
+      <w:r>
+        <w:t>Group F</w:t>
+      </w:r>
+      <w:r>
+        <w:t>)</w:t>
       </w:r>
       <w:r>
         <w:br/>
+      </w:r>
+      <w:r>
+        <w:br/>
+      </w:r>
+      <w:r>
+        <w:rPr>
+          <w:b/>
+        </w:rPr>
+        <w:t xml:space="preserve">Compiled &amp; </w:t>
       </w:r>
       <w:r>
         <w:rPr>
@@ -109,6 +127,60 @@
       </w:r>
       <w:r>
         <w:t>-Mimsiima Mugimbi (221049640)</w:t>
+      </w:r>
+      <w:r>
+        <w:br/>
+      </w:r>
+      <w:r>
+        <w:t>Teboho E</w:t>
+      </w:r>
+      <w:r>
+        <w:t>than</w:t>
+      </w:r>
+      <w:r>
+        <w:t xml:space="preserve"> Kokong</w:t>
+      </w:r>
+      <w:r>
+        <w:t xml:space="preserve"> (</w:t>
+      </w:r>
+      <w:r>
+        <w:t>225003137</w:t>
+      </w:r>
+      <w:r>
+        <w:t>)</w:t>
+      </w:r>
+      <w:r>
+        <w:br/>
+      </w:r>
+      <w:r>
+        <w:t xml:space="preserve">Tokollo Phakoe </w:t>
+      </w:r>
+      <w:r>
+        <w:t>(</w:t>
+      </w:r>
+      <w:r>
+        <w:t>223222580</w:t>
+      </w:r>
+      <w:r>
+        <w:t>)</w:t>
+      </w:r>
+      <w:r>
+        <w:br/>
+      </w:r>
+      <w:r>
+        <w:t xml:space="preserve">Sifiso Mvimbe </w:t>
+      </w:r>
+      <w:r>
+        <w:t>(</w:t>
+      </w:r>
+      <w:r>
+        <w:t>222006949</w:t>
+      </w:r>
+      <w:r>
+        <w:t>)</w:t>
+      </w:r>
+      <w:r>
+        <w:br/>
       </w:r>
       <w:r>
         <w:br/>
@@ -221,7 +293,7 @@
             </w:rPr>
             <w:fldChar w:fldCharType="separate"/>
           </w:r>
-          <w:hyperlink w:anchor="_Toc231403315" w:history="1">
+          <w:hyperlink w:anchor="_Toc231420011" w:history="1">
             <w:r>
               <w:rPr>
                 <w:rStyle w:val="Hyperlink"/>
@@ -249,7 +321,7 @@
                 <w:noProof/>
                 <w:webHidden/>
               </w:rPr>
-              <w:instrText xml:space="preserve"> PAGEREF _Toc231403315 \h </w:instrText>
+              <w:instrText xml:space="preserve"> PAGEREF _Toc231420011 \h </w:instrText>
             </w:r>
             <w:r>
               <w:rPr>
@@ -297,7 +369,7 @@
               <w14:ligatures w14:val="standardContextual"/>
             </w:rPr>
           </w:pPr>
-          <w:hyperlink w:anchor="_Toc231403316" w:history="1">
+          <w:hyperlink w:anchor="_Toc231420012" w:history="1">
             <w:r>
               <w:rPr>
                 <w:rStyle w:val="Hyperlink"/>
@@ -325,7 +397,7 @@
                 <w:noProof/>
                 <w:webHidden/>
               </w:rPr>
-              <w:instrText xml:space="preserve"> PAGEREF _Toc231403316 \h </w:instrText>
+              <w:instrText xml:space="preserve"> PAGEREF _Toc231420012 \h </w:instrText>
             </w:r>
             <w:r>
               <w:rPr>
@@ -373,7 +445,7 @@
               <w14:ligatures w14:val="standardContextual"/>
             </w:rPr>
           </w:pPr>
-          <w:hyperlink w:anchor="_Toc231403317" w:history="1">
+          <w:hyperlink w:anchor="_Toc231420013" w:history="1">
             <w:r>
               <w:rPr>
                 <w:rStyle w:val="Hyperlink"/>
@@ -401,7 +473,7 @@
                 <w:noProof/>
                 <w:webHidden/>
               </w:rPr>
-              <w:instrText xml:space="preserve"> PAGEREF _Toc231403317 \h </w:instrText>
+              <w:instrText xml:space="preserve"> PAGEREF _Toc231420013 \h </w:instrText>
             </w:r>
             <w:r>
               <w:rPr>
@@ -449,7 +521,7 @@
               <w14:ligatures w14:val="standardContextual"/>
             </w:rPr>
           </w:pPr>
-          <w:hyperlink w:anchor="_Toc231403318" w:history="1">
+          <w:hyperlink w:anchor="_Toc231420014" w:history="1">
             <w:r>
               <w:rPr>
                 <w:rStyle w:val="Hyperlink"/>
@@ -477,7 +549,7 @@
                 <w:noProof/>
                 <w:webHidden/>
               </w:rPr>
-              <w:instrText xml:space="preserve"> PAGEREF _Toc231403318 \h </w:instrText>
+              <w:instrText xml:space="preserve"> PAGEREF _Toc231420014 \h </w:instrText>
             </w:r>
             <w:r>
               <w:rPr>
@@ -525,7 +597,7 @@
               <w14:ligatures w14:val="standardContextual"/>
             </w:rPr>
           </w:pPr>
-          <w:hyperlink w:anchor="_Toc231403319" w:history="1">
+          <w:hyperlink w:anchor="_Toc231420015" w:history="1">
             <w:r>
               <w:rPr>
                 <w:rStyle w:val="Hyperlink"/>
@@ -553,7 +625,7 @@
                 <w:noProof/>
                 <w:webHidden/>
               </w:rPr>
-              <w:instrText xml:space="preserve"> PAGEREF _Toc231403319 \h </w:instrText>
+              <w:instrText xml:space="preserve"> PAGEREF _Toc231420015 \h </w:instrText>
             </w:r>
             <w:r>
               <w:rPr>
@@ -601,7 +673,7 @@
               <w14:ligatures w14:val="standardContextual"/>
             </w:rPr>
           </w:pPr>
-          <w:hyperlink w:anchor="_Toc231403320" w:history="1">
+          <w:hyperlink w:anchor="_Toc231420016" w:history="1">
             <w:r>
               <w:rPr>
                 <w:rStyle w:val="Hyperlink"/>
@@ -629,7 +701,7 @@
                 <w:noProof/>
                 <w:webHidden/>
               </w:rPr>
-              <w:instrText xml:space="preserve"> PAGEREF _Toc231403320 \h </w:instrText>
+              <w:instrText xml:space="preserve"> PAGEREF _Toc231420016 \h </w:instrText>
             </w:r>
             <w:r>
               <w:rPr>
@@ -677,7 +749,7 @@
               <w14:ligatures w14:val="standardContextual"/>
             </w:rPr>
           </w:pPr>
-          <w:hyperlink w:anchor="_Toc231403321" w:history="1">
+          <w:hyperlink w:anchor="_Toc231420017" w:history="1">
             <w:r>
               <w:rPr>
                 <w:rStyle w:val="Hyperlink"/>
@@ -705,7 +777,7 @@
                 <w:noProof/>
                 <w:webHidden/>
               </w:rPr>
-              <w:instrText xml:space="preserve"> PAGEREF _Toc231403321 \h </w:instrText>
+              <w:instrText xml:space="preserve"> PAGEREF _Toc231420017 \h </w:instrText>
             </w:r>
             <w:r>
               <w:rPr>
@@ -753,7 +825,7 @@
               <w14:ligatures w14:val="standardContextual"/>
             </w:rPr>
           </w:pPr>
-          <w:hyperlink w:anchor="_Toc231403322" w:history="1">
+          <w:hyperlink w:anchor="_Toc231420018" w:history="1">
             <w:r>
               <w:rPr>
                 <w:rStyle w:val="Hyperlink"/>
@@ -781,7 +853,7 @@
                 <w:noProof/>
                 <w:webHidden/>
               </w:rPr>
-              <w:instrText xml:space="preserve"> PAGEREF _Toc231403322 \h </w:instrText>
+              <w:instrText xml:space="preserve"> PAGEREF _Toc231420018 \h </w:instrText>
             </w:r>
             <w:r>
               <w:rPr>
@@ -829,7 +901,7 @@
               <w14:ligatures w14:val="standardContextual"/>
             </w:rPr>
           </w:pPr>
-          <w:hyperlink w:anchor="_Toc231403323" w:history="1">
+          <w:hyperlink w:anchor="_Toc231420019" w:history="1">
             <w:r>
               <w:rPr>
                 <w:rStyle w:val="Hyperlink"/>
@@ -857,7 +929,7 @@
                 <w:noProof/>
                 <w:webHidden/>
               </w:rPr>
-              <w:instrText xml:space="preserve"> PAGEREF _Toc231403323 \h </w:instrText>
+              <w:instrText xml:space="preserve"> PAGEREF _Toc231420019 \h </w:instrText>
             </w:r>
             <w:r>
               <w:rPr>
@@ -905,7 +977,7 @@
               <w14:ligatures w14:val="standardContextual"/>
             </w:rPr>
           </w:pPr>
-          <w:hyperlink w:anchor="_Toc231403324" w:history="1">
+          <w:hyperlink w:anchor="_Toc231420020" w:history="1">
             <w:r>
               <w:rPr>
                 <w:rStyle w:val="Hyperlink"/>
@@ -933,7 +1005,7 @@
                 <w:noProof/>
                 <w:webHidden/>
               </w:rPr>
-              <w:instrText xml:space="preserve"> PAGEREF _Toc231403324 \h </w:instrText>
+              <w:instrText xml:space="preserve"> PAGEREF _Toc231420020 \h </w:instrText>
             </w:r>
             <w:r>
               <w:rPr>
@@ -981,7 +1053,7 @@
               <w14:ligatures w14:val="standardContextual"/>
             </w:rPr>
           </w:pPr>
-          <w:hyperlink w:anchor="_Toc231403325" w:history="1">
+          <w:hyperlink w:anchor="_Toc231420021" w:history="1">
             <w:r>
               <w:rPr>
                 <w:rStyle w:val="Hyperlink"/>
@@ -1009,7 +1081,7 @@
                 <w:noProof/>
                 <w:webHidden/>
               </w:rPr>
-              <w:instrText xml:space="preserve"> PAGEREF _Toc231403325 \h </w:instrText>
+              <w:instrText xml:space="preserve"> PAGEREF _Toc231420021 \h </w:instrText>
             </w:r>
             <w:r>
               <w:rPr>
@@ -1057,7 +1129,7 @@
               <w14:ligatures w14:val="standardContextual"/>
             </w:rPr>
           </w:pPr>
-          <w:hyperlink w:anchor="_Toc231403326" w:history="1">
+          <w:hyperlink w:anchor="_Toc231420022" w:history="1">
             <w:r>
               <w:rPr>
                 <w:rStyle w:val="Hyperlink"/>
@@ -1085,7 +1157,7 @@
                 <w:noProof/>
                 <w:webHidden/>
               </w:rPr>
-              <w:instrText xml:space="preserve"> PAGEREF _Toc231403326 \h </w:instrText>
+              <w:instrText xml:space="preserve"> PAGEREF _Toc231420022 \h </w:instrText>
             </w:r>
             <w:r>
               <w:rPr>
@@ -1133,7 +1205,7 @@
               <w14:ligatures w14:val="standardContextual"/>
             </w:rPr>
           </w:pPr>
-          <w:hyperlink w:anchor="_Toc231403327" w:history="1">
+          <w:hyperlink w:anchor="_Toc231420023" w:history="1">
             <w:r>
               <w:rPr>
                 <w:rStyle w:val="Hyperlink"/>
@@ -1161,7 +1233,7 @@
                 <w:noProof/>
                 <w:webHidden/>
               </w:rPr>
-              <w:instrText xml:space="preserve"> PAGEREF _Toc231403327 \h </w:instrText>
+              <w:instrText xml:space="preserve"> PAGEREF _Toc231420023 \h </w:instrText>
             </w:r>
             <w:r>
               <w:rPr>
@@ -1209,7 +1281,7 @@
               <w14:ligatures w14:val="standardContextual"/>
             </w:rPr>
           </w:pPr>
-          <w:hyperlink w:anchor="_Toc231403328" w:history="1">
+          <w:hyperlink w:anchor="_Toc231420024" w:history="1">
             <w:r>
               <w:rPr>
                 <w:rStyle w:val="Hyperlink"/>
@@ -1237,7 +1309,7 @@
                 <w:noProof/>
                 <w:webHidden/>
               </w:rPr>
-              <w:instrText xml:space="preserve"> PAGEREF _Toc231403328 \h </w:instrText>
+              <w:instrText xml:space="preserve"> PAGEREF _Toc231420024 \h </w:instrText>
             </w:r>
             <w:r>
               <w:rPr>
@@ -1285,7 +1357,7 @@
               <w14:ligatures w14:val="standardContextual"/>
             </w:rPr>
           </w:pPr>
-          <w:hyperlink w:anchor="_Toc231403329" w:history="1">
+          <w:hyperlink w:anchor="_Toc231420025" w:history="1">
             <w:r>
               <w:rPr>
                 <w:rStyle w:val="Hyperlink"/>
@@ -1313,7 +1385,7 @@
                 <w:noProof/>
                 <w:webHidden/>
               </w:rPr>
-              <w:instrText xml:space="preserve"> PAGEREF _Toc231403329 \h </w:instrText>
+              <w:instrText xml:space="preserve"> PAGEREF _Toc231420025 \h </w:instrText>
             </w:r>
             <w:r>
               <w:rPr>
@@ -1361,7 +1433,7 @@
               <w14:ligatures w14:val="standardContextual"/>
             </w:rPr>
           </w:pPr>
-          <w:hyperlink w:anchor="_Toc231403330" w:history="1">
+          <w:hyperlink w:anchor="_Toc231420026" w:history="1">
             <w:r>
               <w:rPr>
                 <w:rStyle w:val="Hyperlink"/>
@@ -1389,7 +1461,7 @@
                 <w:noProof/>
                 <w:webHidden/>
               </w:rPr>
-              <w:instrText xml:space="preserve"> PAGEREF _Toc231403330 \h </w:instrText>
+              <w:instrText xml:space="preserve"> PAGEREF _Toc231420026 \h </w:instrText>
             </w:r>
             <w:r>
               <w:rPr>
@@ -1437,7 +1509,7 @@
               <w14:ligatures w14:val="standardContextual"/>
             </w:rPr>
           </w:pPr>
-          <w:hyperlink w:anchor="_Toc231403331" w:history="1">
+          <w:hyperlink w:anchor="_Toc231420027" w:history="1">
             <w:r>
               <w:rPr>
                 <w:rStyle w:val="Hyperlink"/>
@@ -1465,7 +1537,7 @@
                 <w:noProof/>
                 <w:webHidden/>
               </w:rPr>
-              <w:instrText xml:space="preserve"> PAGEREF _Toc231403331 \h </w:instrText>
+              <w:instrText xml:space="preserve"> PAGEREF _Toc231420027 \h </w:instrText>
             </w:r>
             <w:r>
               <w:rPr>
@@ -1513,7 +1585,7 @@
               <w14:ligatures w14:val="standardContextual"/>
             </w:rPr>
           </w:pPr>
-          <w:hyperlink w:anchor="_Toc231403332" w:history="1">
+          <w:hyperlink w:anchor="_Toc231420028" w:history="1">
             <w:r>
               <w:rPr>
                 <w:rStyle w:val="Hyperlink"/>
@@ -1541,7 +1613,7 @@
                 <w:noProof/>
                 <w:webHidden/>
               </w:rPr>
-              <w:instrText xml:space="preserve"> PAGEREF _Toc231403332 \h </w:instrText>
+              <w:instrText xml:space="preserve"> PAGEREF _Toc231420028 \h </w:instrText>
             </w:r>
             <w:r>
               <w:rPr>
@@ -1589,7 +1661,7 @@
               <w14:ligatures w14:val="standardContextual"/>
             </w:rPr>
           </w:pPr>
-          <w:hyperlink w:anchor="_Toc231403333" w:history="1">
+          <w:hyperlink w:anchor="_Toc231420029" w:history="1">
             <w:r>
               <w:rPr>
                 <w:rStyle w:val="Hyperlink"/>
@@ -1617,83 +1689,7 @@
                 <w:noProof/>
                 <w:webHidden/>
               </w:rPr>
-              <w:instrText xml:space="preserve"> PAGEREF _Toc231403333 \h </w:instrText>
-            </w:r>
-            <w:r>
-              <w:rPr>
-                <w:noProof/>
-                <w:webHidden/>
-              </w:rPr>
-            </w:r>
-            <w:r>
-              <w:rPr>
-                <w:noProof/>
-                <w:webHidden/>
-              </w:rPr>
-              <w:fldChar w:fldCharType="separate"/>
-            </w:r>
-            <w:r>
-              <w:rPr>
-                <w:noProof/>
-                <w:webHidden/>
-              </w:rPr>
-              <w:t>12</w:t>
-            </w:r>
-            <w:r>
-              <w:rPr>
-                <w:noProof/>
-                <w:webHidden/>
-              </w:rPr>
-              <w:fldChar w:fldCharType="end"/>
-            </w:r>
-          </w:hyperlink>
-        </w:p>
-        <w:p>
-          <w:pPr>
-            <w:pStyle w:val="TOC2"/>
-            <w:tabs>
-              <w:tab w:val="right" w:leader="dot" w:pos="9019"/>
-            </w:tabs>
-            <w:rPr>
-              <w:rFonts w:asciiTheme="minorHAnsi" w:hAnsiTheme="minorHAnsi"/>
-              <w:noProof/>
-              <w:color w:val="auto"/>
-              <w:kern w:val="2"/>
-              <w:sz w:val="24"/>
-              <w:szCs w:val="24"/>
-              <w:lang w:val="en-ZA" w:eastAsia="en-ZA"/>
-              <w14:ligatures w14:val="standardContextual"/>
-            </w:rPr>
-          </w:pPr>
-          <w:hyperlink w:anchor="_Toc231403334" w:history="1">
-            <w:r>
-              <w:rPr>
-                <w:rStyle w:val="Hyperlink"/>
-                <w:rFonts w:cs="Arial"/>
-                <w:noProof/>
-              </w:rPr>
-              <w:t>14.2 Physical File Distribution &amp; Folder Map Tree</w:t>
-            </w:r>
-            <w:r>
-              <w:rPr>
-                <w:noProof/>
-                <w:webHidden/>
-              </w:rPr>
-              <w:tab/>
-            </w:r>
-            <w:r>
-              <w:rPr>
-                <w:noProof/>
-                <w:webHidden/>
-              </w:rPr>
-              <w:fldChar w:fldCharType="begin"/>
-            </w:r>
-            <w:r>
-              <w:rPr>
-                <w:noProof/>
-                <w:webHidden/>
-              </w:rPr>
-              <w:instrText xml:space="preserve"> PAGEREF _Toc231403334 \h </w:instrText>
+              <w:instrText xml:space="preserve"> PAGEREF _Toc231420029 \h </w:instrText>
             </w:r>
             <w:r>
               <w:rPr>
@@ -1741,7 +1737,7 @@
               <w14:ligatures w14:val="standardContextual"/>
             </w:rPr>
           </w:pPr>
-          <w:hyperlink w:anchor="_Toc231403335" w:history="1">
+          <w:hyperlink w:anchor="_Toc231420030" w:history="1">
             <w:r>
               <w:rPr>
                 <w:rStyle w:val="Hyperlink"/>
@@ -1769,7 +1765,7 @@
                 <w:noProof/>
                 <w:webHidden/>
               </w:rPr>
-              <w:instrText xml:space="preserve"> PAGEREF _Toc231403335 \h </w:instrText>
+              <w:instrText xml:space="preserve"> PAGEREF _Toc231420030 \h </w:instrText>
             </w:r>
             <w:r>
               <w:rPr>
@@ -1789,7 +1785,7 @@
                 <w:noProof/>
                 <w:webHidden/>
               </w:rPr>
-              <w:t>13</w:t>
+              <w:t>12</w:t>
             </w:r>
             <w:r>
               <w:rPr>
@@ -1817,7 +1813,7 @@
               <w14:ligatures w14:val="standardContextual"/>
             </w:rPr>
           </w:pPr>
-          <w:hyperlink w:anchor="_Toc231403336" w:history="1">
+          <w:hyperlink w:anchor="_Toc231420031" w:history="1">
             <w:r>
               <w:rPr>
                 <w:rStyle w:val="Hyperlink"/>
@@ -1845,7 +1841,7 @@
                 <w:noProof/>
                 <w:webHidden/>
               </w:rPr>
-              <w:instrText xml:space="preserve"> PAGEREF _Toc231403336 \h </w:instrText>
+              <w:instrText xml:space="preserve"> PAGEREF _Toc231420031 \h </w:instrText>
             </w:r>
             <w:r>
               <w:rPr>
@@ -1865,7 +1861,7 @@
                 <w:noProof/>
                 <w:webHidden/>
               </w:rPr>
-              <w:t>13</w:t>
+              <w:t>19</w:t>
             </w:r>
             <w:r>
               <w:rPr>
@@ -1893,7 +1889,7 @@
               <w14:ligatures w14:val="standardContextual"/>
             </w:rPr>
           </w:pPr>
-          <w:hyperlink w:anchor="_Toc231403337" w:history="1">
+          <w:hyperlink w:anchor="_Toc231420032" w:history="1">
             <w:r>
               <w:rPr>
                 <w:rStyle w:val="Hyperlink"/>
@@ -1921,7 +1917,7 @@
                 <w:noProof/>
                 <w:webHidden/>
               </w:rPr>
-              <w:instrText xml:space="preserve"> PAGEREF _Toc231403337 \h </w:instrText>
+              <w:instrText xml:space="preserve"> PAGEREF _Toc231420032 \h </w:instrText>
             </w:r>
             <w:r>
               <w:rPr>
@@ -1941,7 +1937,7 @@
                 <w:noProof/>
                 <w:webHidden/>
               </w:rPr>
-              <w:t>14</w:t>
+              <w:t>19</w:t>
             </w:r>
             <w:r>
               <w:rPr>
@@ -1969,7 +1965,7 @@
               <w14:ligatures w14:val="standardContextual"/>
             </w:rPr>
           </w:pPr>
-          <w:hyperlink w:anchor="_Toc231403338" w:history="1">
+          <w:hyperlink w:anchor="_Toc231420033" w:history="1">
             <w:r>
               <w:rPr>
                 <w:rStyle w:val="Hyperlink"/>
@@ -1997,7 +1993,7 @@
                 <w:noProof/>
                 <w:webHidden/>
               </w:rPr>
-              <w:instrText xml:space="preserve"> PAGEREF _Toc231403338 \h </w:instrText>
+              <w:instrText xml:space="preserve"> PAGEREF _Toc231420033 \h </w:instrText>
             </w:r>
             <w:r>
               <w:rPr>
@@ -2017,7 +2013,7 @@
                 <w:noProof/>
                 <w:webHidden/>
               </w:rPr>
-              <w:t>14</w:t>
+              <w:t>19</w:t>
             </w:r>
             <w:r>
               <w:rPr>
@@ -2045,7 +2041,7 @@
               <w14:ligatures w14:val="standardContextual"/>
             </w:rPr>
           </w:pPr>
-          <w:hyperlink w:anchor="_Toc231403339" w:history="1">
+          <w:hyperlink w:anchor="_Toc231420034" w:history="1">
             <w:r>
               <w:rPr>
                 <w:rStyle w:val="Hyperlink"/>
@@ -2073,7 +2069,7 @@
                 <w:noProof/>
                 <w:webHidden/>
               </w:rPr>
-              <w:instrText xml:space="preserve"> PAGEREF _Toc231403339 \h </w:instrText>
+              <w:instrText xml:space="preserve"> PAGEREF _Toc231420034 \h </w:instrText>
             </w:r>
             <w:r>
               <w:rPr>
@@ -2093,7 +2089,7 @@
                 <w:noProof/>
                 <w:webHidden/>
               </w:rPr>
-              <w:t>14</w:t>
+              <w:t>20</w:t>
             </w:r>
             <w:r>
               <w:rPr>
@@ -2154,7 +2150,7 @@
           <w:szCs w:val="36"/>
         </w:rPr>
       </w:pPr>
-      <w:bookmarkStart w:id="0" w:name="_Toc231403315"/>
+      <w:bookmarkStart w:id="0" w:name="_Toc231420011"/>
       <w:r>
         <w:rPr>
           <w:rFonts w:ascii="Arial" w:hAnsi="Arial" w:cs="Arial"/>
@@ -2187,7 +2183,7 @@
           <w:szCs w:val="36"/>
         </w:rPr>
       </w:pPr>
-      <w:bookmarkStart w:id="1" w:name="_Toc231403316"/>
+      <w:bookmarkStart w:id="1" w:name="_Toc231420012"/>
       <w:r>
         <w:rPr>
           <w:rFonts w:ascii="Arial" w:hAnsi="Arial" w:cs="Arial"/>
@@ -2209,7 +2205,7 @@
           <w:szCs w:val="28"/>
         </w:rPr>
       </w:pPr>
-      <w:bookmarkStart w:id="2" w:name="_Toc231403317"/>
+      <w:bookmarkStart w:id="2" w:name="_Toc231420013"/>
       <w:r>
         <w:rPr>
           <w:rFonts w:ascii="Arial" w:hAnsi="Arial" w:cs="Arial"/>
@@ -2263,7 +2259,13 @@
         <w:t>Queue Report Submission Form:</w:t>
       </w:r>
       <w:r>
-        <w:t xml:space="preserve"> Authenticated users can transmit active reports outlining wait minutes, structural queues status, and contextual notes.</w:t>
+        <w:t xml:space="preserve"> Authenticated users can transmit active reports outlining </w:t>
+      </w:r>
+      <w:r>
+        <w:t>waiting</w:t>
+      </w:r>
+      <w:r>
+        <w:t xml:space="preserve"> minutes, structural queues status, and contextual notes.</w:t>
       </w:r>
     </w:p>
     <w:p>
@@ -2351,7 +2353,7 @@
           <w:szCs w:val="28"/>
         </w:rPr>
       </w:pPr>
-      <w:bookmarkStart w:id="3" w:name="_Toc231403318"/>
+      <w:bookmarkStart w:id="3" w:name="_Toc231420014"/>
       <w:r>
         <w:rPr>
           <w:rFonts w:ascii="Arial" w:hAnsi="Arial" w:cs="Arial"/>
@@ -2449,7 +2451,7 @@
           <w:szCs w:val="36"/>
         </w:rPr>
       </w:pPr>
-      <w:bookmarkStart w:id="4" w:name="_Toc231403319"/>
+      <w:bookmarkStart w:id="4" w:name="_Toc231420015"/>
       <w:r>
         <w:rPr>
           <w:rFonts w:ascii="Arial" w:hAnsi="Arial" w:cs="Arial"/>
@@ -2521,7 +2523,7 @@
           <w:szCs w:val="36"/>
         </w:rPr>
       </w:pPr>
-      <w:bookmarkStart w:id="5" w:name="_Toc231403320"/>
+      <w:bookmarkStart w:id="5" w:name="_Toc231420016"/>
       <w:r>
         <w:rPr>
           <w:rFonts w:ascii="Arial" w:hAnsi="Arial" w:cs="Arial"/>
@@ -3449,7 +3451,7 @@
           <w:szCs w:val="36"/>
         </w:rPr>
       </w:pPr>
-      <w:bookmarkStart w:id="6" w:name="_Toc231403321"/>
+      <w:bookmarkStart w:id="6" w:name="_Toc231420017"/>
       <w:r>
         <w:rPr>
           <w:rFonts w:ascii="Arial" w:hAnsi="Arial" w:cs="Arial"/>
@@ -3485,10 +3487,19 @@
         <w:rPr>
           <w:b/>
         </w:rPr>
-        <w:t>Primary Actor:</w:t>
-      </w:r>
-      <w:r>
-        <w:t>Citizens seeking public facility wait profiles.</w:t>
+        <w:t xml:space="preserve">Primary </w:t>
+      </w:r>
+      <w:r>
+        <w:rPr>
+          <w:b/>
+        </w:rPr>
+        <w:t>Actor:</w:t>
+      </w:r>
+      <w:r>
+        <w:t xml:space="preserve"> Citizens</w:t>
+      </w:r>
+      <w:r>
+        <w:t xml:space="preserve"> seeking public facility wait profiles.</w:t>
       </w:r>
     </w:p>
     <w:p>
@@ -3503,7 +3514,10 @@
         <w:t>Goal:</w:t>
       </w:r>
       <w:r>
-        <w:t>The actor filters regional facilities on the platform to verify if their intended destination is heavily congested.</w:t>
+        <w:t xml:space="preserve"> The</w:t>
+      </w:r>
+      <w:r>
+        <w:t xml:space="preserve"> actor filters regional facilities on the platform to verify if their intended destination is heavily congested.</w:t>
       </w:r>
     </w:p>
     <w:p>
@@ -3561,10 +3575,19 @@
         <w:rPr>
           <w:b/>
         </w:rPr>
-        <w:t>Primary Actor:</w:t>
-      </w:r>
-      <w:r>
-        <w:t>Registered Community Member.</w:t>
+        <w:t xml:space="preserve">Primary </w:t>
+      </w:r>
+      <w:r>
+        <w:rPr>
+          <w:b/>
+        </w:rPr>
+        <w:t>Actor:</w:t>
+      </w:r>
+      <w:r>
+        <w:t xml:space="preserve"> Registered</w:t>
+      </w:r>
+      <w:r>
+        <w:t xml:space="preserve"> Community Member.</w:t>
       </w:r>
     </w:p>
     <w:p>
@@ -3579,7 +3602,10 @@
         <w:t>Goal:</w:t>
       </w:r>
       <w:r>
-        <w:t>To publish active crowd conditions at a specific branch.</w:t>
+        <w:t xml:space="preserve"> To</w:t>
+      </w:r>
+      <w:r>
+        <w:t xml:space="preserve"> publish active crowd conditions at a specific branch.</w:t>
       </w:r>
     </w:p>
     <w:p>
@@ -3637,10 +3663,19 @@
         <w:rPr>
           <w:b/>
         </w:rPr>
-        <w:t>Primary Actor:</w:t>
-      </w:r>
-      <w:r>
-        <w:t>System Administrator.</w:t>
+        <w:t xml:space="preserve">Primary </w:t>
+      </w:r>
+      <w:r>
+        <w:rPr>
+          <w:b/>
+        </w:rPr>
+        <w:t>Actor:</w:t>
+      </w:r>
+      <w:r>
+        <w:t xml:space="preserve"> System</w:t>
+      </w:r>
+      <w:r>
+        <w:t xml:space="preserve"> Administrator.</w:t>
       </w:r>
     </w:p>
     <w:p>
@@ -3656,7 +3691,10 @@
         <w:t>Goal:</w:t>
       </w:r>
       <w:r>
-        <w:t>To purge malicious data and clean the reporting metrics.</w:t>
+        <w:t xml:space="preserve"> To</w:t>
+      </w:r>
+      <w:r>
+        <w:t xml:space="preserve"> purge malicious data and clean the reporting metrics.</w:t>
       </w:r>
     </w:p>
     <w:p>
@@ -3700,7 +3738,7 @@
           <w:szCs w:val="36"/>
         </w:rPr>
       </w:pPr>
-      <w:bookmarkStart w:id="7" w:name="_Toc231403322"/>
+      <w:bookmarkStart w:id="7" w:name="_Toc231420018"/>
       <w:r>
         <w:rPr>
           <w:rFonts w:ascii="Arial" w:hAnsi="Arial" w:cs="Arial"/>
@@ -3788,7 +3826,7 @@
           <w:szCs w:val="36"/>
         </w:rPr>
       </w:pPr>
-      <w:bookmarkStart w:id="8" w:name="_Toc231403323"/>
+      <w:bookmarkStart w:id="8" w:name="_Toc231420019"/>
       <w:r>
         <w:rPr>
           <w:rFonts w:ascii="Arial" w:hAnsi="Arial" w:cs="Arial"/>
@@ -3877,7 +3915,7 @@
           <w:szCs w:val="36"/>
         </w:rPr>
       </w:pPr>
-      <w:bookmarkStart w:id="9" w:name="_Toc231403324"/>
+      <w:bookmarkStart w:id="9" w:name="_Toc231420020"/>
       <w:r>
         <w:rPr>
           <w:rFonts w:ascii="Arial" w:hAnsi="Arial" w:cs="Arial"/>
@@ -3966,7 +4004,7 @@
           <w:szCs w:val="36"/>
         </w:rPr>
       </w:pPr>
-      <w:bookmarkStart w:id="10" w:name="_Toc231403325"/>
+      <w:bookmarkStart w:id="10" w:name="_Toc231420021"/>
       <w:r>
         <w:rPr>
           <w:rFonts w:ascii="Arial" w:hAnsi="Arial" w:cs="Arial"/>
@@ -3995,7 +4033,13 @@
         <w:t>Client Presentation Layer (Frontend):</w:t>
       </w:r>
       <w:r>
-        <w:t xml:space="preserve"> High-contrast static layouts constructed in pure HTML5, layout rules in CSS3, and application flow managed via vanilla ES6 Javascript. No single-page framework overhead is introduced.</w:t>
+        <w:t xml:space="preserve"> High-contrast static layouts constructed in pure HTML5, layout rules in CSS3, and application flow managed via vanilla ES6 </w:t>
+      </w:r>
+      <w:r>
+        <w:t>JavaScript</w:t>
+      </w:r>
+      <w:r>
+        <w:t>. No single-page framework overhead is introduced.</w:t>
       </w:r>
     </w:p>
     <w:p>
@@ -4053,7 +4097,7 @@
           <w:szCs w:val="36"/>
         </w:rPr>
       </w:pPr>
-      <w:bookmarkStart w:id="11" w:name="_Toc231403326"/>
+      <w:bookmarkStart w:id="11" w:name="_Toc231420022"/>
       <w:r>
         <w:rPr>
           <w:rFonts w:ascii="Arial" w:hAnsi="Arial" w:cs="Arial"/>
@@ -4126,7 +4170,7 @@
           <w:szCs w:val="36"/>
         </w:rPr>
       </w:pPr>
-      <w:bookmarkStart w:id="12" w:name="_Toc231403327"/>
+      <w:bookmarkStart w:id="12" w:name="_Toc231420023"/>
       <w:r>
         <w:rPr>
           <w:rFonts w:ascii="Arial" w:hAnsi="Arial" w:cs="Arial"/>
@@ -4145,7 +4189,7 @@
           <w:rFonts w:ascii="Arial" w:hAnsi="Arial" w:cs="Arial"/>
         </w:rPr>
       </w:pPr>
-      <w:bookmarkStart w:id="13" w:name="_Toc231403328"/>
+      <w:bookmarkStart w:id="13" w:name="_Toc231420024"/>
       <w:r>
         <w:rPr>
           <w:rFonts w:ascii="Arial" w:hAnsi="Arial" w:cs="Arial"/>
@@ -4829,7 +4873,7 @@
           <w:szCs w:val="28"/>
         </w:rPr>
       </w:pPr>
-      <w:bookmarkStart w:id="14" w:name="_Toc231403329"/>
+      <w:bookmarkStart w:id="14" w:name="_Toc231420025"/>
       <w:r>
         <w:rPr>
           <w:rFonts w:ascii="Arial" w:hAnsi="Arial" w:cs="Arial"/>
@@ -5093,7 +5137,7 @@
           <w:szCs w:val="28"/>
         </w:rPr>
       </w:pPr>
-      <w:bookmarkStart w:id="15" w:name="_Toc231403330"/>
+      <w:bookmarkStart w:id="15" w:name="_Toc231420026"/>
       <w:r>
         <w:rPr>
           <w:rFonts w:ascii="Arial" w:hAnsi="Arial" w:cs="Arial"/>
@@ -5652,7 +5696,7 @@
           <w:szCs w:val="36"/>
         </w:rPr>
       </w:pPr>
-      <w:bookmarkStart w:id="16" w:name="_Toc231403331"/>
+      <w:bookmarkStart w:id="16" w:name="_Toc231420027"/>
       <w:r>
         <w:rPr>
           <w:rFonts w:ascii="Arial" w:hAnsi="Arial" w:cs="Arial"/>
@@ -5734,7 +5778,7 @@
           <w:szCs w:val="36"/>
         </w:rPr>
       </w:pPr>
-      <w:bookmarkStart w:id="17" w:name="_Toc231403332"/>
+      <w:bookmarkStart w:id="17" w:name="_Toc231420028"/>
       <w:r>
         <w:rPr>
           <w:rFonts w:ascii="Arial" w:hAnsi="Arial" w:cs="Arial"/>
@@ -5757,7 +5801,7 @@
           <w:szCs w:val="28"/>
         </w:rPr>
       </w:pPr>
-      <w:bookmarkStart w:id="18" w:name="_Toc231403333"/>
+      <w:bookmarkStart w:id="18" w:name="_Toc231420029"/>
       <w:r>
         <w:rPr>
           <w:rFonts w:ascii="Arial" w:hAnsi="Arial" w:cs="Arial"/>
@@ -5911,151 +5955,6 @@
       <w:r>
         <w:br/>
         <w:t xml:space="preserve">  - CreatedAt (DATETIME, Defaulting to Current Timestamp)</w:t>
-      </w:r>
-      <w:r>
-        <w:br/>
-      </w:r>
-    </w:p>
-    <w:p>
-      <w:pPr>
-        <w:pStyle w:val="Heading2"/>
-        <w:rPr>
-          <w:rFonts w:ascii="Arial" w:hAnsi="Arial" w:cs="Arial"/>
-          <w:color w:val="auto"/>
-          <w:sz w:val="28"/>
-          <w:szCs w:val="28"/>
-        </w:rPr>
-      </w:pPr>
-      <w:bookmarkStart w:id="19" w:name="_Toc231403334"/>
-      <w:commentRangeStart w:id="20"/>
-      <w:r>
-        <w:rPr>
-          <w:rFonts w:ascii="Arial" w:hAnsi="Arial" w:cs="Arial"/>
-          <w:color w:val="auto"/>
-          <w:sz w:val="28"/>
-          <w:szCs w:val="28"/>
-        </w:rPr>
-        <w:t>14.2 Physical File Distribution &amp; Folder Map Tree</w:t>
-      </w:r>
-      <w:bookmarkEnd w:id="19"/>
-      <w:commentRangeEnd w:id="20"/>
-      <w:r>
-        <w:rPr>
-          <w:rStyle w:val="CommentReference"/>
-          <w:rFonts w:ascii="Arial" w:hAnsi="Arial" w:cs="Arial"/>
-          <w:color w:val="auto"/>
-          <w:sz w:val="28"/>
-          <w:szCs w:val="28"/>
-        </w:rPr>
-        <w:commentReference w:id="20"/>
-      </w:r>
-    </w:p>
-    <w:p>
-      <w:pPr>
-        <w:ind w:left="360"/>
-      </w:pPr>
-      <w:r>
-        <w:t>/ (Project Root Directory)</w:t>
-      </w:r>
-      <w:r>
-        <w:br/>
-        <w:t>├── .env                        ← Stores session secrets, Brevo HTTP API keys, port allocations</w:t>
-      </w:r>
-      <w:r>
-        <w:br/>
-        <w:t>├── .gitignore                  ← Prevents checking in database.sqlite file, local nodes module modules</w:t>
-      </w:r>
-      <w:r>
-        <w:br/>
-        <w:t>├── package.json                ← Configuration for scripts starting backend pipeline via subfolders</w:t>
-      </w:r>
-      <w:r>
-        <w:br/>
-        <w:t>├── public/                     ← Houses static client assets served by logic systems</w:t>
-      </w:r>
-      <w:r>
-        <w:br/>
-        <w:t>│   ├── css/</w:t>
-      </w:r>
-      <w:r>
-        <w:br/>
-        <w:t>│   │   └── style.css           ← Central shared stylesheet managing application aesthetics</w:t>
-      </w:r>
-      <w:r>
-        <w:br/>
-        <w:t>│   ├── js/</w:t>
-      </w:r>
-      <w:r>
-        <w:br/>
-        <w:t xml:space="preserve">│   │   ├── script.js           ← Coordinates real-time branch data processing and filter </w:t>
-      </w:r>
-      <w:r>
-        <w:lastRenderedPageBreak/>
-        <w:t>actions</w:t>
-      </w:r>
-      <w:r>
-        <w:br/>
-        <w:t>│   │   ├── nav-auth.js         ← Adjusts header layouts based on session storage states</w:t>
-      </w:r>
-      <w:r>
-        <w:br/>
-        <w:t>│   │   └── profile.js          ← Powers account settings tracking views</w:t>
-      </w:r>
-      <w:r>
-        <w:br/>
-        <w:t>│   ├── index.html              ← Landing hub housing metrics tiles and queue Tic-Tac-Toe minigame</w:t>
-      </w:r>
-      <w:r>
-        <w:br/>
-        <w:t>│   ├── branches.html           ← Displays the complete branch matrix equipped with advanced filter panels</w:t>
-      </w:r>
-      <w:r>
-        <w:br/>
-        <w:t>│   ├── branch.html             ← Detail interface with chronological feeds and maps context grids</w:t>
-      </w:r>
-      <w:r>
-        <w:br/>
-        <w:t>│   ├── auth.html               ← Unified interface managing registration and user logins</w:t>
-      </w:r>
-      <w:r>
-        <w:br/>
-        <w:t>│   ├── reset.html              ← Account password restoration layout using base64 tokens</w:t>
-      </w:r>
-      <w:r>
-        <w:br/>
-        <w:t>│   ├── report.html             ← Authenticated panel for transmitting fresh queue report metrics</w:t>
-      </w:r>
-      <w:r>
-        <w:br/>
-        <w:t>│   └── admin.html              ← Administration moderation layout for flag operations</w:t>
-      </w:r>
-      <w:r>
-        <w:br/>
-        <w:t>└── server/</w:t>
-      </w:r>
-      <w:r>
-        <w:br/>
-        <w:t xml:space="preserve">    ├── server.js               ← Base Express server mounting routing modules and session rules</w:t>
-      </w:r>
-      <w:r>
-        <w:br/>
-        <w:t xml:space="preserve">    ├── db.js                   ← Controls SQLite engine setups and structural seed files</w:t>
-      </w:r>
-      <w:r>
-        <w:br/>
-        <w:t xml:space="preserve">    └── routes/</w:t>
-      </w:r>
-      <w:r>
-        <w:br/>
-        <w:t xml:space="preserve">        ├── auth.js             ← Manages registration logic and CAPTCHA rendering</w:t>
-      </w:r>
-      <w:r>
-        <w:br/>
-        <w:t xml:space="preserve">        ├── branches.js         ← Read-only API delivering real-time computed branch telemetry</w:t>
-      </w:r>
-      <w:r>
-        <w:br/>
-        <w:t xml:space="preserve">        └── reports.js          ← Governs report processing and admin moderation lines</w:t>
       </w:r>
       <w:r>
         <w:br/>
@@ -6071,7 +5970,7 @@
           <w:szCs w:val="36"/>
         </w:rPr>
       </w:pPr>
-      <w:bookmarkStart w:id="21" w:name="_Toc231403335"/>
+      <w:bookmarkStart w:id="19" w:name="_Toc231420030"/>
       <w:r>
         <w:rPr>
           <w:rFonts w:ascii="Arial" w:hAnsi="Arial" w:cs="Arial"/>
@@ -6079,158 +5978,578 @@
           <w:sz w:val="36"/>
           <w:szCs w:val="36"/>
         </w:rPr>
-        <w:t xml:space="preserve">15. </w:t>
-      </w:r>
-      <w:commentRangeStart w:id="22"/>
-      <w:r>
-        <w:rPr>
-          <w:rFonts w:ascii="Arial" w:hAnsi="Arial" w:cs="Arial"/>
-          <w:color w:val="FFC000"/>
-          <w:sz w:val="36"/>
-          <w:szCs w:val="36"/>
-        </w:rPr>
-        <w:t>Figma (Prototype) Fully Functional</w:t>
-      </w:r>
-      <w:bookmarkEnd w:id="21"/>
-      <w:commentRangeEnd w:id="22"/>
-      <w:r>
-        <w:rPr>
-          <w:rStyle w:val="CommentReference"/>
-          <w:rFonts w:ascii="Arial" w:hAnsi="Arial" w:cs="Arial"/>
-          <w:color w:val="FFC000"/>
-          <w:sz w:val="36"/>
-          <w:szCs w:val="36"/>
-        </w:rPr>
-        <w:commentReference w:id="22"/>
-      </w:r>
+        <w:t>15. Figma (Prototype) Fully Functional</w:t>
+      </w:r>
+      <w:bookmarkEnd w:id="19"/>
     </w:p>
     <w:p>
       <w:r>
-        <w:t>The visual user interface architecture was fully structured in Figma prior to physical implementation. It models exact operational views including reactive component state definitions, element hierarchies, and viewport breakpoints across mobile and desktop platforms.</w:t>
-      </w:r>
-    </w:p>
-    <w:tbl>
-      <w:tblPr>
-        <w:tblW w:w="0" w:type="auto"/>
-        <w:jc w:val="center"/>
-        <w:tblLook w:val="04A0" w:firstRow="1" w:lastRow="0" w:firstColumn="1" w:lastColumn="0" w:noHBand="0" w:noVBand="1"/>
-      </w:tblPr>
-      <w:tblGrid>
-        <w:gridCol w:w="9029"/>
-      </w:tblGrid>
-      <w:tr>
-        <w:trPr>
-          <w:jc w:val="center"/>
-        </w:trPr>
-        <w:tc>
-          <w:tcPr>
-            <w:tcW w:w="9029" w:type="dxa"/>
-            <w:tcBorders>
-              <w:left w:val="single" w:sz="24" w:space="0" w:color="F5C518"/>
-            </w:tcBorders>
-            <w:shd w:val="clear" w:color="auto" w:fill="1A1D23"/>
-            <w:tcMar>
-              <w:top w:w="140" w:type="dxa"/>
-              <w:left w:w="200" w:type="dxa"/>
-              <w:bottom w:w="140" w:type="dxa"/>
-              <w:right w:w="200" w:type="dxa"/>
-            </w:tcMar>
-          </w:tcPr>
-          <w:p>
-            <w:pPr>
-              <w:spacing w:after="40"/>
-            </w:pPr>
-            <w:r>
-              <w:rPr>
-                <w:b/>
-                <w:color w:val="F5C518"/>
-              </w:rPr>
-              <w:t xml:space="preserve">★ FIGMA SCREENSHOT PLACEHOLDER: </w:t>
-            </w:r>
-            <w:r>
-              <w:rPr>
-                <w:color w:val="F0F2F8"/>
-              </w:rPr>
-              <w:t>Please insert the exported UI prototype screenshots here. The prototype mapping covers all 11 user states including user login pages, active multi-dropdown configurations, report forms with preset inputs, and administration tables featuring row removal buttons.</w:t>
-            </w:r>
-            <w:r>
-              <w:br/>
-            </w:r>
-          </w:p>
-        </w:tc>
-      </w:tr>
-    </w:tbl>
-    <w:p>
-      <w:pPr>
-        <w:pStyle w:val="Heading1"/>
-        <w:rPr>
-          <w:rFonts w:ascii="Arial" w:hAnsi="Arial" w:cs="Arial"/>
-          <w:color w:val="FFC000"/>
-          <w:sz w:val="36"/>
-          <w:szCs w:val="36"/>
-        </w:rPr>
-      </w:pPr>
-      <w:bookmarkStart w:id="23" w:name="_Toc231403336"/>
-      <w:r>
-        <w:rPr>
-          <w:rFonts w:ascii="Arial" w:hAnsi="Arial" w:cs="Arial"/>
-          <w:color w:val="FFC000"/>
-          <w:sz w:val="36"/>
-          <w:szCs w:val="36"/>
-        </w:rPr>
-        <w:t>16. Main Streams</w:t>
-      </w:r>
-      <w:bookmarkEnd w:id="23"/>
-    </w:p>
-    <w:p>
-      <w:r>
-        <w:t>The application operates across three fundamental data processing and transaction streams:</w:t>
+        <w:t xml:space="preserve">The visual user interface architecture was </w:t>
+      </w:r>
+      <w:r>
+        <w:t>compiled</w:t>
+      </w:r>
+      <w:r>
+        <w:t xml:space="preserve"> </w:t>
+      </w:r>
+      <w:r>
+        <w:t xml:space="preserve">after </w:t>
+      </w:r>
+      <w:r>
+        <w:t>physical implementation. It models exact operational views including reactive component state definitions, element hierarchies, and viewport breakpoints across mobile and desktop platforms.</w:t>
       </w:r>
     </w:p>
     <w:p>
       <w:pPr>
-        <w:pStyle w:val="ListBullet"/>
-        <w:spacing w:after="60"/>
+        <w:rPr>
+          <w:noProof/>
+        </w:rPr>
       </w:pPr>
       <w:r>
         <w:rPr>
-          <w:b/>
+          <w:noProof/>
         </w:rPr>
-        <w:t>The Public Telemetry Consumption Stream:</w:t>
-      </w:r>
-      <w:r>
-        <w:t xml:space="preserve"> Unauthenticated request for branches -&gt; API aggregates rows via complex subqueries -&gt; Javascript formats numerical data objects -&gt; Cards update instantly inside the DOM grid layout view.</w:t>
+        <w:lastRenderedPageBreak/>
+        <w:drawing>
+          <wp:inline distT="0" distB="0" distL="0" distR="0" wp14:anchorId="189B285F" wp14:editId="76779BA1">
+            <wp:extent cx="5722620" cy="7856220"/>
+            <wp:effectExtent l="0" t="0" r="0" b="0"/>
+            <wp:docPr id="157426097" name="Picture 1"/>
+            <wp:cNvGraphicFramePr>
+              <a:graphicFrameLocks xmlns:a="http://schemas.openxmlformats.org/drawingml/2006/main" noChangeAspect="1"/>
+            </wp:cNvGraphicFramePr>
+            <a:graphic xmlns:a="http://schemas.openxmlformats.org/drawingml/2006/main">
+              <a:graphicData uri="http://schemas.openxmlformats.org/drawingml/2006/picture">
+                <pic:pic xmlns:pic="http://schemas.openxmlformats.org/drawingml/2006/picture">
+                  <pic:nvPicPr>
+                    <pic:cNvPr id="0" name="Picture 1"/>
+                    <pic:cNvPicPr>
+                      <a:picLocks noChangeAspect="1" noChangeArrowheads="1"/>
+                    </pic:cNvPicPr>
+                  </pic:nvPicPr>
+                  <pic:blipFill>
+                    <a:blip r:embed="rId11">
+                      <a:extLst>
+                        <a:ext uri="{28A0092B-C50C-407E-A947-70E740481C1C}">
+                          <a14:useLocalDpi xmlns:a14="http://schemas.microsoft.com/office/drawing/2010/main" val="0"/>
+                        </a:ext>
+                      </a:extLst>
+                    </a:blip>
+                    <a:srcRect/>
+                    <a:stretch>
+                      <a:fillRect/>
+                    </a:stretch>
+                  </pic:blipFill>
+                  <pic:spPr bwMode="auto">
+                    <a:xfrm>
+                      <a:off x="0" y="0"/>
+                      <a:ext cx="5722620" cy="7856220"/>
+                    </a:xfrm>
+                    <a:prstGeom prst="rect">
+                      <a:avLst/>
+                    </a:prstGeom>
+                    <a:noFill/>
+                    <a:ln>
+                      <a:noFill/>
+                    </a:ln>
+                  </pic:spPr>
+                </pic:pic>
+              </a:graphicData>
+            </a:graphic>
+          </wp:inline>
+        </w:drawing>
+      </w:r>
+      <w:r>
+        <w:rPr>
+          <w:noProof/>
+        </w:rPr>
+        <w:lastRenderedPageBreak/>
+        <w:drawing>
+          <wp:inline distT="0" distB="0" distL="0" distR="0" wp14:anchorId="7A8F9ADE" wp14:editId="743109BF">
+            <wp:extent cx="5722620" cy="8161020"/>
+            <wp:effectExtent l="0" t="0" r="0" b="0"/>
+            <wp:docPr id="1456618234" name="Picture 2"/>
+            <wp:cNvGraphicFramePr>
+              <a:graphicFrameLocks xmlns:a="http://schemas.openxmlformats.org/drawingml/2006/main" noChangeAspect="1"/>
+            </wp:cNvGraphicFramePr>
+            <a:graphic xmlns:a="http://schemas.openxmlformats.org/drawingml/2006/main">
+              <a:graphicData uri="http://schemas.openxmlformats.org/drawingml/2006/picture">
+                <pic:pic xmlns:pic="http://schemas.openxmlformats.org/drawingml/2006/picture">
+                  <pic:nvPicPr>
+                    <pic:cNvPr id="0" name="Picture 2"/>
+                    <pic:cNvPicPr>
+                      <a:picLocks noChangeAspect="1" noChangeArrowheads="1"/>
+                    </pic:cNvPicPr>
+                  </pic:nvPicPr>
+                  <pic:blipFill>
+                    <a:blip r:embed="rId12">
+                      <a:extLst>
+                        <a:ext uri="{28A0092B-C50C-407E-A947-70E740481C1C}">
+                          <a14:useLocalDpi xmlns:a14="http://schemas.microsoft.com/office/drawing/2010/main" val="0"/>
+                        </a:ext>
+                      </a:extLst>
+                    </a:blip>
+                    <a:srcRect/>
+                    <a:stretch>
+                      <a:fillRect/>
+                    </a:stretch>
+                  </pic:blipFill>
+                  <pic:spPr bwMode="auto">
+                    <a:xfrm>
+                      <a:off x="0" y="0"/>
+                      <a:ext cx="5722620" cy="8161020"/>
+                    </a:xfrm>
+                    <a:prstGeom prst="rect">
+                      <a:avLst/>
+                    </a:prstGeom>
+                    <a:noFill/>
+                    <a:ln>
+                      <a:noFill/>
+                    </a:ln>
+                  </pic:spPr>
+                </pic:pic>
+              </a:graphicData>
+            </a:graphic>
+          </wp:inline>
+        </w:drawing>
+      </w:r>
+      <w:r>
+        <w:rPr>
+          <w:noProof/>
+        </w:rPr>
+        <w:lastRenderedPageBreak/>
+        <w:drawing>
+          <wp:inline distT="0" distB="0" distL="0" distR="0" wp14:anchorId="62A42D8F" wp14:editId="0CB3F2A7">
+            <wp:extent cx="5722620" cy="4366260"/>
+            <wp:effectExtent l="0" t="0" r="0" b="0"/>
+            <wp:docPr id="1608706496" name="Picture 3"/>
+            <wp:cNvGraphicFramePr>
+              <a:graphicFrameLocks xmlns:a="http://schemas.openxmlformats.org/drawingml/2006/main" noChangeAspect="1"/>
+            </wp:cNvGraphicFramePr>
+            <a:graphic xmlns:a="http://schemas.openxmlformats.org/drawingml/2006/main">
+              <a:graphicData uri="http://schemas.openxmlformats.org/drawingml/2006/picture">
+                <pic:pic xmlns:pic="http://schemas.openxmlformats.org/drawingml/2006/picture">
+                  <pic:nvPicPr>
+                    <pic:cNvPr id="0" name="Picture 3"/>
+                    <pic:cNvPicPr>
+                      <a:picLocks noChangeAspect="1" noChangeArrowheads="1"/>
+                    </pic:cNvPicPr>
+                  </pic:nvPicPr>
+                  <pic:blipFill>
+                    <a:blip r:embed="rId13">
+                      <a:extLst>
+                        <a:ext uri="{28A0092B-C50C-407E-A947-70E740481C1C}">
+                          <a14:useLocalDpi xmlns:a14="http://schemas.microsoft.com/office/drawing/2010/main" val="0"/>
+                        </a:ext>
+                      </a:extLst>
+                    </a:blip>
+                    <a:srcRect/>
+                    <a:stretch>
+                      <a:fillRect/>
+                    </a:stretch>
+                  </pic:blipFill>
+                  <pic:spPr bwMode="auto">
+                    <a:xfrm>
+                      <a:off x="0" y="0"/>
+                      <a:ext cx="5722620" cy="4366260"/>
+                    </a:xfrm>
+                    <a:prstGeom prst="rect">
+                      <a:avLst/>
+                    </a:prstGeom>
+                    <a:noFill/>
+                    <a:ln>
+                      <a:noFill/>
+                    </a:ln>
+                  </pic:spPr>
+                </pic:pic>
+              </a:graphicData>
+            </a:graphic>
+          </wp:inline>
+        </w:drawing>
+      </w:r>
+      <w:r>
+        <w:rPr>
+          <w:noProof/>
+        </w:rPr>
+        <w:lastRenderedPageBreak/>
+        <w:drawing>
+          <wp:inline distT="0" distB="0" distL="0" distR="0" wp14:anchorId="2373A332" wp14:editId="3508D01C">
+            <wp:extent cx="5722620" cy="4602480"/>
+            <wp:effectExtent l="0" t="0" r="0" b="7620"/>
+            <wp:docPr id="1633561376" name="Picture 4"/>
+            <wp:cNvGraphicFramePr>
+              <a:graphicFrameLocks xmlns:a="http://schemas.openxmlformats.org/drawingml/2006/main" noChangeAspect="1"/>
+            </wp:cNvGraphicFramePr>
+            <a:graphic xmlns:a="http://schemas.openxmlformats.org/drawingml/2006/main">
+              <a:graphicData uri="http://schemas.openxmlformats.org/drawingml/2006/picture">
+                <pic:pic xmlns:pic="http://schemas.openxmlformats.org/drawingml/2006/picture">
+                  <pic:nvPicPr>
+                    <pic:cNvPr id="0" name="Picture 4"/>
+                    <pic:cNvPicPr>
+                      <a:picLocks noChangeAspect="1" noChangeArrowheads="1"/>
+                    </pic:cNvPicPr>
+                  </pic:nvPicPr>
+                  <pic:blipFill>
+                    <a:blip r:embed="rId14">
+                      <a:extLst>
+                        <a:ext uri="{28A0092B-C50C-407E-A947-70E740481C1C}">
+                          <a14:useLocalDpi xmlns:a14="http://schemas.microsoft.com/office/drawing/2010/main" val="0"/>
+                        </a:ext>
+                      </a:extLst>
+                    </a:blip>
+                    <a:srcRect/>
+                    <a:stretch>
+                      <a:fillRect/>
+                    </a:stretch>
+                  </pic:blipFill>
+                  <pic:spPr bwMode="auto">
+                    <a:xfrm>
+                      <a:off x="0" y="0"/>
+                      <a:ext cx="5722620" cy="4602480"/>
+                    </a:xfrm>
+                    <a:prstGeom prst="rect">
+                      <a:avLst/>
+                    </a:prstGeom>
+                    <a:noFill/>
+                    <a:ln>
+                      <a:noFill/>
+                    </a:ln>
+                  </pic:spPr>
+                </pic:pic>
+              </a:graphicData>
+            </a:graphic>
+          </wp:inline>
+        </w:drawing>
+      </w:r>
+      <w:r>
+        <w:rPr>
+          <w:noProof/>
+        </w:rPr>
+        <w:br/>
+      </w:r>
+      <w:r>
+        <w:rPr>
+          <w:noProof/>
+        </w:rPr>
+        <w:br/>
+      </w:r>
+      <w:r>
+        <w:rPr>
+          <w:noProof/>
+        </w:rPr>
+        <w:drawing>
+          <wp:inline distT="0" distB="0" distL="0" distR="0" wp14:anchorId="483D0812" wp14:editId="6015A081">
+            <wp:extent cx="5722620" cy="2743200"/>
+            <wp:effectExtent l="0" t="0" r="0" b="0"/>
+            <wp:docPr id="868587814" name="Picture 5"/>
+            <wp:cNvGraphicFramePr>
+              <a:graphicFrameLocks xmlns:a="http://schemas.openxmlformats.org/drawingml/2006/main" noChangeAspect="1"/>
+            </wp:cNvGraphicFramePr>
+            <a:graphic xmlns:a="http://schemas.openxmlformats.org/drawingml/2006/main">
+              <a:graphicData uri="http://schemas.openxmlformats.org/drawingml/2006/picture">
+                <pic:pic xmlns:pic="http://schemas.openxmlformats.org/drawingml/2006/picture">
+                  <pic:nvPicPr>
+                    <pic:cNvPr id="0" name="Picture 5"/>
+                    <pic:cNvPicPr>
+                      <a:picLocks noChangeAspect="1" noChangeArrowheads="1"/>
+                    </pic:cNvPicPr>
+                  </pic:nvPicPr>
+                  <pic:blipFill>
+                    <a:blip r:embed="rId15">
+                      <a:extLst>
+                        <a:ext uri="{28A0092B-C50C-407E-A947-70E740481C1C}">
+                          <a14:useLocalDpi xmlns:a14="http://schemas.microsoft.com/office/drawing/2010/main" val="0"/>
+                        </a:ext>
+                      </a:extLst>
+                    </a:blip>
+                    <a:srcRect/>
+                    <a:stretch>
+                      <a:fillRect/>
+                    </a:stretch>
+                  </pic:blipFill>
+                  <pic:spPr bwMode="auto">
+                    <a:xfrm>
+                      <a:off x="0" y="0"/>
+                      <a:ext cx="5722620" cy="2743200"/>
+                    </a:xfrm>
+                    <a:prstGeom prst="rect">
+                      <a:avLst/>
+                    </a:prstGeom>
+                    <a:noFill/>
+                    <a:ln>
+                      <a:noFill/>
+                    </a:ln>
+                  </pic:spPr>
+                </pic:pic>
+              </a:graphicData>
+            </a:graphic>
+          </wp:inline>
+        </w:drawing>
+      </w:r>
+      <w:r>
+        <w:rPr>
+          <w:noProof/>
+        </w:rPr>
+        <w:lastRenderedPageBreak/>
+        <w:drawing>
+          <wp:inline distT="0" distB="0" distL="0" distR="0" wp14:anchorId="1ECA523C" wp14:editId="1E36771E">
+            <wp:extent cx="5722620" cy="3718560"/>
+            <wp:effectExtent l="0" t="0" r="0" b="0"/>
+            <wp:docPr id="993708793" name="Picture 6"/>
+            <wp:cNvGraphicFramePr>
+              <a:graphicFrameLocks xmlns:a="http://schemas.openxmlformats.org/drawingml/2006/main" noChangeAspect="1"/>
+            </wp:cNvGraphicFramePr>
+            <a:graphic xmlns:a="http://schemas.openxmlformats.org/drawingml/2006/main">
+              <a:graphicData uri="http://schemas.openxmlformats.org/drawingml/2006/picture">
+                <pic:pic xmlns:pic="http://schemas.openxmlformats.org/drawingml/2006/picture">
+                  <pic:nvPicPr>
+                    <pic:cNvPr id="0" name="Picture 6"/>
+                    <pic:cNvPicPr>
+                      <a:picLocks noChangeAspect="1" noChangeArrowheads="1"/>
+                    </pic:cNvPicPr>
+                  </pic:nvPicPr>
+                  <pic:blipFill>
+                    <a:blip r:embed="rId16">
+                      <a:extLst>
+                        <a:ext uri="{28A0092B-C50C-407E-A947-70E740481C1C}">
+                          <a14:useLocalDpi xmlns:a14="http://schemas.microsoft.com/office/drawing/2010/main" val="0"/>
+                        </a:ext>
+                      </a:extLst>
+                    </a:blip>
+                    <a:srcRect/>
+                    <a:stretch>
+                      <a:fillRect/>
+                    </a:stretch>
+                  </pic:blipFill>
+                  <pic:spPr bwMode="auto">
+                    <a:xfrm>
+                      <a:off x="0" y="0"/>
+                      <a:ext cx="5722620" cy="3718560"/>
+                    </a:xfrm>
+                    <a:prstGeom prst="rect">
+                      <a:avLst/>
+                    </a:prstGeom>
+                    <a:noFill/>
+                    <a:ln>
+                      <a:noFill/>
+                    </a:ln>
+                  </pic:spPr>
+                </pic:pic>
+              </a:graphicData>
+            </a:graphic>
+          </wp:inline>
+        </w:drawing>
+      </w:r>
+      <w:r>
+        <w:rPr>
+          <w:noProof/>
+        </w:rPr>
+        <w:br/>
+      </w:r>
+      <w:r>
+        <w:rPr>
+          <w:noProof/>
+        </w:rPr>
+        <w:br/>
+      </w:r>
+      <w:r>
+        <w:rPr>
+          <w:noProof/>
+        </w:rPr>
+        <w:br/>
+      </w:r>
+      <w:r>
+        <w:rPr>
+          <w:noProof/>
+        </w:rPr>
+        <w:drawing>
+          <wp:inline distT="0" distB="0" distL="0" distR="0" wp14:anchorId="2E6110C0" wp14:editId="025FD446">
+            <wp:extent cx="5722620" cy="3314700"/>
+            <wp:effectExtent l="0" t="0" r="0" b="0"/>
+            <wp:docPr id="2117068516" name="Picture 7"/>
+            <wp:cNvGraphicFramePr>
+              <a:graphicFrameLocks xmlns:a="http://schemas.openxmlformats.org/drawingml/2006/main" noChangeAspect="1"/>
+            </wp:cNvGraphicFramePr>
+            <a:graphic xmlns:a="http://schemas.openxmlformats.org/drawingml/2006/main">
+              <a:graphicData uri="http://schemas.openxmlformats.org/drawingml/2006/picture">
+                <pic:pic xmlns:pic="http://schemas.openxmlformats.org/drawingml/2006/picture">
+                  <pic:nvPicPr>
+                    <pic:cNvPr id="0" name="Picture 7"/>
+                    <pic:cNvPicPr>
+                      <a:picLocks noChangeAspect="1" noChangeArrowheads="1"/>
+                    </pic:cNvPicPr>
+                  </pic:nvPicPr>
+                  <pic:blipFill>
+                    <a:blip r:embed="rId17">
+                      <a:extLst>
+                        <a:ext uri="{28A0092B-C50C-407E-A947-70E740481C1C}">
+                          <a14:useLocalDpi xmlns:a14="http://schemas.microsoft.com/office/drawing/2010/main" val="0"/>
+                        </a:ext>
+                      </a:extLst>
+                    </a:blip>
+                    <a:srcRect/>
+                    <a:stretch>
+                      <a:fillRect/>
+                    </a:stretch>
+                  </pic:blipFill>
+                  <pic:spPr bwMode="auto">
+                    <a:xfrm>
+                      <a:off x="0" y="0"/>
+                      <a:ext cx="5722620" cy="3314700"/>
+                    </a:xfrm>
+                    <a:prstGeom prst="rect">
+                      <a:avLst/>
+                    </a:prstGeom>
+                    <a:noFill/>
+                    <a:ln>
+                      <a:noFill/>
+                    </a:ln>
+                  </pic:spPr>
+                </pic:pic>
+              </a:graphicData>
+            </a:graphic>
+          </wp:inline>
+        </w:drawing>
       </w:r>
     </w:p>
     <w:p>
       <w:pPr>
-        <w:pStyle w:val="ListBullet"/>
-        <w:spacing w:after="60"/>
+        <w:rPr>
+          <w:noProof/>
+        </w:rPr>
       </w:pPr>
       <w:r>
         <w:rPr>
-          <w:b/>
+          <w:noProof/>
+        </w:rPr>
+        <w:br w:type="page"/>
+      </w:r>
+    </w:p>
+    <w:p>
+      <w:r>
+        <w:rPr>
+          <w:noProof/>
         </w:rPr>
         <w:lastRenderedPageBreak/>
-        <w:t>The Crowdsourced Reporting Submission Stream:</w:t>
-      </w:r>
-      <w:r>
-        <w:t xml:space="preserve"> User triggers report submission -&gt; Javascript checks credentials status -&gt; Form content converts to a JSON payload -&gt; Express handles field validation -&gt; Transaction commits to SQLite file.</w:t>
-      </w:r>
-    </w:p>
-    <w:p>
-      <w:pPr>
-        <w:pStyle w:val="ListBullet"/>
-        <w:spacing w:after="60"/>
-      </w:pPr>
+        <w:drawing>
+          <wp:inline distT="0" distB="0" distL="0" distR="0" wp14:anchorId="62F4AF13" wp14:editId="0BC6B4C1">
+            <wp:extent cx="5722620" cy="3535680"/>
+            <wp:effectExtent l="0" t="0" r="0" b="7620"/>
+            <wp:docPr id="605742887" name="Picture 8"/>
+            <wp:cNvGraphicFramePr>
+              <a:graphicFrameLocks xmlns:a="http://schemas.openxmlformats.org/drawingml/2006/main" noChangeAspect="1"/>
+            </wp:cNvGraphicFramePr>
+            <a:graphic xmlns:a="http://schemas.openxmlformats.org/drawingml/2006/main">
+              <a:graphicData uri="http://schemas.openxmlformats.org/drawingml/2006/picture">
+                <pic:pic xmlns:pic="http://schemas.openxmlformats.org/drawingml/2006/picture">
+                  <pic:nvPicPr>
+                    <pic:cNvPr id="0" name="Picture 8"/>
+                    <pic:cNvPicPr>
+                      <a:picLocks noChangeAspect="1" noChangeArrowheads="1"/>
+                    </pic:cNvPicPr>
+                  </pic:nvPicPr>
+                  <pic:blipFill>
+                    <a:blip r:embed="rId18">
+                      <a:extLst>
+                        <a:ext uri="{28A0092B-C50C-407E-A947-70E740481C1C}">
+                          <a14:useLocalDpi xmlns:a14="http://schemas.microsoft.com/office/drawing/2010/main" val="0"/>
+                        </a:ext>
+                      </a:extLst>
+                    </a:blip>
+                    <a:srcRect/>
+                    <a:stretch>
+                      <a:fillRect/>
+                    </a:stretch>
+                  </pic:blipFill>
+                  <pic:spPr bwMode="auto">
+                    <a:xfrm>
+                      <a:off x="0" y="0"/>
+                      <a:ext cx="5722620" cy="3535680"/>
+                    </a:xfrm>
+                    <a:prstGeom prst="rect">
+                      <a:avLst/>
+                    </a:prstGeom>
+                    <a:noFill/>
+                    <a:ln>
+                      <a:noFill/>
+                    </a:ln>
+                  </pic:spPr>
+                </pic:pic>
+              </a:graphicData>
+            </a:graphic>
+          </wp:inline>
+        </w:drawing>
+      </w:r>
       <w:r>
         <w:rPr>
-          <w:b/>
+          <w:noProof/>
         </w:rPr>
-        <w:t>The Data Moderation &amp; Compliance Stream:</w:t>
-      </w:r>
-      <w:r>
-        <w:t xml:space="preserve"> Admin logs onto system panel -&gt; Backend validates session variables -&gt; System surfaces all reporting data -&gt; Operator hits deletion control -&gt; Row is purged, and statistics recalculate immediately.</w:t>
+        <w:br/>
+      </w:r>
+      <w:r>
+        <w:rPr>
+          <w:noProof/>
+        </w:rPr>
+        <w:br/>
+      </w:r>
+      <w:r>
+        <w:rPr>
+          <w:noProof/>
+        </w:rPr>
+        <w:br/>
+      </w:r>
+      <w:r>
+        <w:rPr>
+          <w:noProof/>
+        </w:rPr>
+        <w:drawing>
+          <wp:inline distT="0" distB="0" distL="0" distR="0" wp14:anchorId="565811CA" wp14:editId="5268711A">
+            <wp:extent cx="5722620" cy="4015740"/>
+            <wp:effectExtent l="0" t="0" r="0" b="3810"/>
+            <wp:docPr id="42289945" name="Picture 9"/>
+            <wp:cNvGraphicFramePr>
+              <a:graphicFrameLocks xmlns:a="http://schemas.openxmlformats.org/drawingml/2006/main" noChangeAspect="1"/>
+            </wp:cNvGraphicFramePr>
+            <a:graphic xmlns:a="http://schemas.openxmlformats.org/drawingml/2006/main">
+              <a:graphicData uri="http://schemas.openxmlformats.org/drawingml/2006/picture">
+                <pic:pic xmlns:pic="http://schemas.openxmlformats.org/drawingml/2006/picture">
+                  <pic:nvPicPr>
+                    <pic:cNvPr id="0" name="Picture 9"/>
+                    <pic:cNvPicPr>
+                      <a:picLocks noChangeAspect="1" noChangeArrowheads="1"/>
+                    </pic:cNvPicPr>
+                  </pic:nvPicPr>
+                  <pic:blipFill>
+                    <a:blip r:embed="rId19">
+                      <a:extLst>
+                        <a:ext uri="{28A0092B-C50C-407E-A947-70E740481C1C}">
+                          <a14:useLocalDpi xmlns:a14="http://schemas.microsoft.com/office/drawing/2010/main" val="0"/>
+                        </a:ext>
+                      </a:extLst>
+                    </a:blip>
+                    <a:srcRect/>
+                    <a:stretch>
+                      <a:fillRect/>
+                    </a:stretch>
+                  </pic:blipFill>
+                  <pic:spPr bwMode="auto">
+                    <a:xfrm>
+                      <a:off x="0" y="0"/>
+                      <a:ext cx="5722620" cy="4015740"/>
+                    </a:xfrm>
+                    <a:prstGeom prst="rect">
+                      <a:avLst/>
+                    </a:prstGeom>
+                    <a:noFill/>
+                    <a:ln>
+                      <a:noFill/>
+                    </a:ln>
+                  </pic:spPr>
+                </pic:pic>
+              </a:graphicData>
+            </a:graphic>
+          </wp:inline>
+        </w:drawing>
       </w:r>
     </w:p>
     <w:p>
@@ -6243,7 +6562,7 @@
           <w:szCs w:val="36"/>
         </w:rPr>
       </w:pPr>
-      <w:bookmarkStart w:id="24" w:name="_Toc231403337"/>
+      <w:bookmarkStart w:id="20" w:name="_Toc231420031"/>
       <w:r>
         <w:rPr>
           <w:rFonts w:ascii="Arial" w:hAnsi="Arial" w:cs="Arial"/>
@@ -6251,13 +6570,14 @@
           <w:sz w:val="36"/>
           <w:szCs w:val="36"/>
         </w:rPr>
-        <w:t>17. User Interface Must Be User-Friendly</w:t>
-      </w:r>
-      <w:bookmarkEnd w:id="24"/>
+        <w:lastRenderedPageBreak/>
+        <w:t>16. Main Streams</w:t>
+      </w:r>
+      <w:bookmarkEnd w:id="20"/>
     </w:p>
     <w:p>
       <w:r>
-        <w:t>The system design adheres strictly to the following visual usability principles to ensure accessible operation for all South African citizens:</w:t>
+        <w:t>The application operates across three fundamental data processing and transaction streams:</w:t>
       </w:r>
     </w:p>
     <w:p>
@@ -6269,10 +6589,16 @@
         <w:rPr>
           <w:b/>
         </w:rPr>
-        <w:t>High-Contrast Status Badging:</w:t>
-      </w:r>
-      <w:r>
-        <w:t xml:space="preserve"> Visual indicators update their color state instantly according to current queue density: Green indicates 'Quiet' conditions, Orange indicates 'Busy', Red-Orange alerts to 'Very Busy' lines, and Slate Grey denotes system failures.</w:t>
+        <w:t>The Public Telemetry Consumption Stream:</w:t>
+      </w:r>
+      <w:r>
+        <w:t xml:space="preserve"> Unauthenticated request for branches -&gt; API aggregates rows via complex subqueries -&gt; </w:t>
+      </w:r>
+      <w:r>
+        <w:t>JavaScript</w:t>
+      </w:r>
+      <w:r>
+        <w:t xml:space="preserve"> formats numerical data objects -&gt; Cards update instantly inside the DOM grid layout view.</w:t>
       </w:r>
     </w:p>
     <w:p>
@@ -6284,10 +6610,16 @@
         <w:rPr>
           <w:b/>
         </w:rPr>
-        <w:t>Thumb-Optimized Target Zones:</w:t>
-      </w:r>
-      <w:r>
-        <w:t xml:space="preserve"> All interactive buttons and input controls feature a touch target size of at least 44x44 points, ensuring easy selection on low-cost smartphones with unstable displays.</w:t>
+        <w:t>The Crowdsourced Reporting Submission Stream:</w:t>
+      </w:r>
+      <w:r>
+        <w:t xml:space="preserve"> User triggers report submission -&gt; </w:t>
+      </w:r>
+      <w:r>
+        <w:t>JavaScript</w:t>
+      </w:r>
+      <w:r>
+        <w:t xml:space="preserve"> checks credentials status -&gt; Form content converts to a JSON payload -&gt; Express handles field validation -&gt; Transaction commits to SQLite file.</w:t>
       </w:r>
     </w:p>
     <w:p>
@@ -6299,25 +6631,10 @@
         <w:rPr>
           <w:b/>
         </w:rPr>
-        <w:t>Simplified Time Context:</w:t>
-      </w:r>
-      <w:r>
-        <w:t xml:space="preserve"> Long timestamps convert automatically into relative text labels (e.g., '5 mins ago') using client-side formatting logic, removing cognitive friction for users evaluating information relevance.</w:t>
-      </w:r>
-    </w:p>
-    <w:p>
-      <w:pPr>
-        <w:pStyle w:val="ListBullet"/>
-        <w:spacing w:after="60"/>
-      </w:pPr>
-      <w:r>
-        <w:rPr>
-          <w:b/>
-        </w:rPr>
-        <w:t>Layout-Stabilized Load Indicators:</w:t>
-      </w:r>
-      <w:r>
-        <w:t xml:space="preserve"> Network loading events display an animated pulsing skeleton layout block matching the exact dimensions of incoming branch cards, eliminating layout shift and providing immediate system feedback.</w:t>
+        <w:t>The Data Moderation &amp; Compliance Stream:</w:t>
+      </w:r>
+      <w:r>
+        <w:t xml:space="preserve"> Admin logs onto system panel -&gt; Backend validates session variables -&gt; System surfaces all reporting data -&gt; Operator hits deletion control -&gt; Row is purged, and statistics recalculate immediately.</w:t>
       </w:r>
     </w:p>
     <w:p>
@@ -6330,7 +6647,7 @@
           <w:szCs w:val="36"/>
         </w:rPr>
       </w:pPr>
-      <w:bookmarkStart w:id="25" w:name="_Toc231403338"/>
+      <w:bookmarkStart w:id="21" w:name="_Toc231420032"/>
       <w:r>
         <w:rPr>
           <w:rFonts w:ascii="Arial" w:hAnsi="Arial" w:cs="Arial"/>
@@ -6338,13 +6655,13 @@
           <w:sz w:val="36"/>
           <w:szCs w:val="36"/>
         </w:rPr>
-        <w:t>18. User Experience Flow</w:t>
-      </w:r>
-      <w:bookmarkEnd w:id="25"/>
+        <w:t>17. User Interface Must Be User-Friendly</w:t>
+      </w:r>
+      <w:bookmarkEnd w:id="21"/>
     </w:p>
     <w:p>
       <w:r>
-        <w:t>The citizen journey is designed to minimize interactions, allowing users to find critical queue information in under three taps:</w:t>
+        <w:t>The system design adheres strictly to the following visual usability principles to ensure accessible operation for all South African citizens:</w:t>
       </w:r>
     </w:p>
     <w:p>
@@ -6356,10 +6673,10 @@
         <w:rPr>
           <w:b/>
         </w:rPr>
-        <w:t>Tap 1 (Discovery):</w:t>
-      </w:r>
-      <w:r>
-        <w:t xml:space="preserve"> Consumer arrives on index.html, checks the global statistics counter summary bar, and immediately sees current service metrics without navigating off the landing page.</w:t>
+        <w:t>High-Contrast Status Badging:</w:t>
+      </w:r>
+      <w:r>
+        <w:t xml:space="preserve"> Visual indicators update their color state instantly according to current queue density: Green indicates 'Quiet' conditions, Orange indicates 'Busy', Red-Orange alerts to 'Very Busy' lines, and Slate Grey denotes system failures.</w:t>
       </w:r>
     </w:p>
     <w:p>
@@ -6371,10 +6688,10 @@
         <w:rPr>
           <w:b/>
         </w:rPr>
-        <w:t>Tap 2 (Target Isolation):</w:t>
-      </w:r>
-      <w:r>
-        <w:t xml:space="preserve"> Consumer opens the advanced search dropdown filters on branches.html, filtering listings down to nearby offices instantly via dynamic client-side filtering.</w:t>
+        <w:t>Thumb-Optimized Target Zones:</w:t>
+      </w:r>
+      <w:r>
+        <w:t xml:space="preserve"> All interactive buttons and input controls feature a touch target size of at least 44x44 points, ensuring easy selection on low-cost smartphones with unstable displays.</w:t>
       </w:r>
     </w:p>
     <w:p>
@@ -6386,10 +6703,25 @@
         <w:rPr>
           <w:b/>
         </w:rPr>
-        <w:t>Tap 3 (Verification Summary):</w:t>
-      </w:r>
-      <w:r>
-        <w:t xml:space="preserve"> Consumer clicks an operational office card, opening branch.html to view active timelines, crowd logs, and location context grids.</w:t>
+        <w:t>Simplified Time Context:</w:t>
+      </w:r>
+      <w:r>
+        <w:t xml:space="preserve"> Long timestamps convert automatically into relative text labels (e.g., '5 mins ago') using client-side formatting logic, removing cognitive friction for users evaluating information relevance.</w:t>
+      </w:r>
+    </w:p>
+    <w:p>
+      <w:pPr>
+        <w:pStyle w:val="ListBullet"/>
+        <w:spacing w:after="60"/>
+      </w:pPr>
+      <w:r>
+        <w:rPr>
+          <w:b/>
+        </w:rPr>
+        <w:t>Layout-Stabilized Load Indicators:</w:t>
+      </w:r>
+      <w:r>
+        <w:t xml:space="preserve"> Network loading events display an animated pulsing skeleton layout block matching the exact dimensions of incoming branch cards, eliminating layout shift and providing immediate system feedback.</w:t>
       </w:r>
     </w:p>
     <w:p>
@@ -6402,7 +6734,7 @@
           <w:szCs w:val="36"/>
         </w:rPr>
       </w:pPr>
-      <w:bookmarkStart w:id="26" w:name="_Toc231403339"/>
+      <w:bookmarkStart w:id="22" w:name="_Toc231420033"/>
       <w:r>
         <w:rPr>
           <w:rFonts w:ascii="Arial" w:hAnsi="Arial" w:cs="Arial"/>
@@ -6410,13 +6742,13 @@
           <w:sz w:val="36"/>
           <w:szCs w:val="36"/>
         </w:rPr>
-        <w:t>19. Clickable Interaction</w:t>
-      </w:r>
-      <w:bookmarkEnd w:id="26"/>
+        <w:t>18. User Experience Flow</w:t>
+      </w:r>
+      <w:bookmarkEnd w:id="22"/>
     </w:p>
     <w:p>
       <w:r>
-        <w:t>The system features highly responsive client-side visual interactions to deliver immediate feedback when elements are selected:</w:t>
+        <w:t>The citizen journey is designed to minimize interactions, allowing users to find critical queue information in under three taps:</w:t>
       </w:r>
     </w:p>
     <w:p>
@@ -6428,10 +6760,10 @@
         <w:rPr>
           <w:b/>
         </w:rPr>
-        <w:t>Asynchronous Filter Switchers:</w:t>
-      </w:r>
-      <w:r>
-        <w:t xml:space="preserve"> Tab headers swap visual states instantly on selection by adjusting CSS class labels, filtering display grids smoothly without triggering full-page web reloads.</w:t>
+        <w:t>Tap 1 (Discovery):</w:t>
+      </w:r>
+      <w:r>
+        <w:t xml:space="preserve"> Consumer arrives on index.html, checks the global statistics counter summary bar, and immediately sees current service metrics without navigating off the landing page.</w:t>
       </w:r>
     </w:p>
     <w:p>
@@ -6443,11 +6775,10 @@
         <w:rPr>
           <w:b/>
         </w:rPr>
-        <w:lastRenderedPageBreak/>
-        <w:t>Contextual Data Forwarding:</w:t>
-      </w:r>
-      <w:r>
-        <w:t xml:space="preserve"> Pressing '+ Add Report' dynamically reads the active branch identifier object from local storage, pre-populating the target input dropdown automatically to avoid user error.</w:t>
+        <w:t>Tap 2 (Target Isolation):</w:t>
+      </w:r>
+      <w:r>
+        <w:t xml:space="preserve"> Consumer opens the advanced search dropdown filters on branches.html, filtering listings down to nearby offices instantly via dynamic client-side filtering.</w:t>
       </w:r>
     </w:p>
     <w:p>
@@ -6459,10 +6790,38 @@
         <w:rPr>
           <w:b/>
         </w:rPr>
-        <w:t>Non-Blocking Toast System Alerts:</w:t>
-      </w:r>
-      <w:r>
-        <w:t xml:space="preserve"> Form submissions trigger an animated toast notification box that slides out from the side margins, giving clear feedback before executing page changes.</w:t>
+        <w:t>Tap 3 (Verification Summary):</w:t>
+      </w:r>
+      <w:r>
+        <w:t xml:space="preserve"> Consumer clicks an operational office card, opening branch.html to view active timelines, crowd logs, and location context grids.</w:t>
+      </w:r>
+    </w:p>
+    <w:p>
+      <w:pPr>
+        <w:pStyle w:val="Heading1"/>
+        <w:rPr>
+          <w:rFonts w:ascii="Arial" w:hAnsi="Arial" w:cs="Arial"/>
+          <w:color w:val="FFC000"/>
+          <w:sz w:val="36"/>
+          <w:szCs w:val="36"/>
+        </w:rPr>
+      </w:pPr>
+      <w:bookmarkStart w:id="23" w:name="_Toc231420034"/>
+      <w:r>
+        <w:rPr>
+          <w:rFonts w:ascii="Arial" w:hAnsi="Arial" w:cs="Arial"/>
+          <w:color w:val="FFC000"/>
+          <w:sz w:val="36"/>
+          <w:szCs w:val="36"/>
+        </w:rPr>
+        <w:lastRenderedPageBreak/>
+        <w:t>19. Clickable Interaction</w:t>
+      </w:r>
+      <w:bookmarkEnd w:id="23"/>
+    </w:p>
+    <w:p>
+      <w:r>
+        <w:t>The system features highly responsive client-side visual interactions to deliver immediate feedback when elements are selected:</w:t>
       </w:r>
     </w:p>
     <w:p>
@@ -6474,6 +6833,51 @@
         <w:rPr>
           <w:b/>
         </w:rPr>
+        <w:t>Asynchronous Filter Switchers:</w:t>
+      </w:r>
+      <w:r>
+        <w:t xml:space="preserve"> Tab headers swap visual states instantly on selection by adjusting CSS class labels, filtering display grids smoothly without triggering full-page web reloads.</w:t>
+      </w:r>
+    </w:p>
+    <w:p>
+      <w:pPr>
+        <w:pStyle w:val="ListBullet"/>
+        <w:spacing w:after="60"/>
+      </w:pPr>
+      <w:r>
+        <w:rPr>
+          <w:b/>
+        </w:rPr>
+        <w:t>Contextual Data Forwarding:</w:t>
+      </w:r>
+      <w:r>
+        <w:t xml:space="preserve"> Pressing '+ Add Report' dynamically reads the active branch identifier object from local storage, pre-populating the target input dropdown automatically to avoid user error.</w:t>
+      </w:r>
+    </w:p>
+    <w:p>
+      <w:pPr>
+        <w:pStyle w:val="ListBullet"/>
+        <w:spacing w:after="60"/>
+      </w:pPr>
+      <w:r>
+        <w:rPr>
+          <w:b/>
+        </w:rPr>
+        <w:t>Non-Blocking Toast System Alerts:</w:t>
+      </w:r>
+      <w:r>
+        <w:t xml:space="preserve"> Form submissions trigger an animated toast notification box that slides out from the side margins, giving clear feedback before executing page changes.</w:t>
+      </w:r>
+    </w:p>
+    <w:p>
+      <w:pPr>
+        <w:pStyle w:val="ListBullet"/>
+        <w:spacing w:after="60"/>
+      </w:pPr>
+      <w:r>
+        <w:rPr>
+          <w:b/>
+        </w:rPr>
         <w:t>Instant-Response Mini-Game Inputs:</w:t>
       </w:r>
       <w:r>
@@ -6481,8 +6885,8 @@
       </w:r>
     </w:p>
     <w:sectPr>
-      <w:headerReference w:type="default" r:id="rId15"/>
-      <w:footerReference w:type="default" r:id="rId16"/>
+      <w:headerReference w:type="default" r:id="rId20"/>
+      <w:footerReference w:type="default" r:id="rId21"/>
       <w:pgSz w:w="11909" w:h="16834"/>
       <w:pgMar w:top="1440" w:right="1440" w:bottom="1440" w:left="1440" w:header="720" w:footer="720" w:gutter="0"/>
       <w:pgNumType w:start="1"/>
@@ -6492,64 +6896,6 @@
     </w:sectPr>
   </w:body>
 </w:document>
-</file>
-
-<file path=word/comments.xml><?xml version="1.0" encoding="utf-8"?>
-<w:comments xmlns:wpc="http://schemas.microsoft.com/office/word/2010/wordprocessingCanvas" xmlns:cx="http://schemas.microsoft.com/office/drawing/2014/chartex" xmlns:cx1="http://schemas.microsoft.com/office/drawing/2015/9/8/chartex" xmlns:cx2="http://schemas.microsoft.com/office/drawing/2015/10/21/chartex" xmlns:cx3="http://schemas.microsoft.com/office/drawing/2016/5/9/chartex" xmlns:cx4="http://schemas.microsoft.com/office/drawing/2016/5/10/chartex" xmlns:cx5="http://schemas.microsoft.com/office/drawing/2016/5/11/chartex" xmlns:cx6="http://schemas.microsoft.com/office/drawing/2016/5/12/chartex" xmlns:cx7="http://schemas.microsoft.com/office/drawing/2016/5/13/chartex" xmlns:cx8="http://schemas.microsoft.com/office/drawing/2016/5/14/chartex" xmlns:mc="http://schemas.openxmlformats.org/markup-compatibility/2006" xmlns:aink="http://schemas.microsoft.com/office/drawing/2016/ink" xmlns:am3d="http://schemas.microsoft.com/office/drawing/2017/model3d" xmlns:o="urn:schemas-microsoft-com:office:office" xmlns:oel="http://schemas.microsoft.com/office/2019/extlst" xmlns:r="http://schemas.openxmlformats.org/officeDocument/2006/relationships" xmlns:m="http://schemas.openxmlformats.org/officeDocument/2006/math" xmlns:v="urn:schemas-microsoft-com:vml" xmlns:wp14="http://schemas.microsoft.com/office/word/2010/wordprocessingDrawing" xmlns:wp="http://schemas.openxmlformats.org/drawingml/2006/wordprocessingDrawing" xmlns:w10="urn:schemas-microsoft-com:office:word" xmlns:w="http://schemas.openxmlformats.org/wordprocessingml/2006/main" xmlns:w14="http://schemas.microsoft.com/office/word/2010/wordml" xmlns:w15="http://schemas.microsoft.com/office/word/2012/wordml" xmlns:w16cex="http://schemas.microsoft.com/office/word/2018/wordml/cex" xmlns:w16cid="http://schemas.microsoft.com/office/word/2016/wordml/cid" xmlns:w16="http://schemas.microsoft.com/office/word/2018/wordml" xmlns:w16du="http://schemas.microsoft.com/office/word/2023/wordml/word16du" xmlns:w16sdtdh="http://schemas.microsoft.com/office/word/2020/wordml/sdtdatahash" xmlns:w16sdtfl="http://schemas.microsoft.com/office/word/2024/wordml/sdtformatlock" xmlns:w16se="http://schemas.microsoft.com/office/word/2015/wordml/symex" xmlns:wpg="http://schemas.microsoft.com/office/word/2010/wordprocessingGroup" xmlns:wpi="http://schemas.microsoft.com/office/word/2010/wordprocessingInk" xmlns:wne="http://schemas.microsoft.com/office/word/2006/wordml" xmlns:wps="http://schemas.microsoft.com/office/word/2010/wordprocessingShape" mc:Ignorable="w14 w15 w16se w16cid w16 w16cex w16sdtdh w16sdtfl w16du wp14">
-  <w:comment w:id="20" w:author="SHANITA MIMSIIMA MUGIMBI" w:date="2026-06-03T18:13:00Z" w:initials="SM">
-    <w:p>
-      <w:pPr>
-        <w:pStyle w:val="CommentText"/>
-      </w:pPr>
-      <w:r>
-        <w:rPr>
-          <w:rStyle w:val="CommentReference"/>
-        </w:rPr>
-        <w:annotationRef/>
-      </w:r>
-      <w:r>
-        <w:t>I don’t know about this, we could keep it or delete it</w:t>
-      </w:r>
-    </w:p>
-  </w:comment>
-  <w:comment w:id="22" w:author="SHANITA MIMSIIMA MUGIMBI" w:date="2026-06-03T18:13:00Z" w:initials="SM">
-    <w:p>
-      <w:pPr>
-        <w:pStyle w:val="CommentText"/>
-      </w:pPr>
-      <w:r>
-        <w:rPr>
-          <w:rStyle w:val="CommentReference"/>
-        </w:rPr>
-        <w:annotationRef/>
-      </w:r>
-      <w:r>
-        <w:t xml:space="preserve">This is what I need help with </w:t>
-      </w:r>
-    </w:p>
-  </w:comment>
-</w:comments>
-</file>
-
-<file path=word/commentsExtended.xml><?xml version="1.0" encoding="utf-8"?>
-<w15:commentsEx xmlns:wpc="http://schemas.microsoft.com/office/word/2010/wordprocessingCanvas" xmlns:cx="http://schemas.microsoft.com/office/drawing/2014/chartex" xmlns:cx1="http://schemas.microsoft.com/office/drawing/2015/9/8/chartex" xmlns:cx2="http://schemas.microsoft.com/office/drawing/2015/10/21/chartex" xmlns:cx3="http://schemas.microsoft.com/office/drawing/2016/5/9/chartex" xmlns:cx4="http://schemas.microsoft.com/office/drawing/2016/5/10/chartex" xmlns:cx5="http://schemas.microsoft.com/office/drawing/2016/5/11/chartex" xmlns:cx6="http://schemas.microsoft.com/office/drawing/2016/5/12/chartex" xmlns:cx7="http://schemas.microsoft.com/office/drawing/2016/5/13/chartex" xmlns:cx8="http://schemas.microsoft.com/office/drawing/2016/5/14/chartex" xmlns:mc="http://schemas.openxmlformats.org/markup-compatibility/2006" xmlns:aink="http://schemas.microsoft.com/office/drawing/2016/ink" xmlns:am3d="http://schemas.microsoft.com/office/drawing/2017/model3d" xmlns:o="urn:schemas-microsoft-com:office:office" xmlns:oel="http://schemas.microsoft.com/office/2019/extlst" xmlns:r="http://schemas.openxmlformats.org/officeDocument/2006/relationships" xmlns:m="http://schemas.openxmlformats.org/officeDocument/2006/math" xmlns:v="urn:schemas-microsoft-com:vml" xmlns:wp14="http://schemas.microsoft.com/office/word/2010/wordprocessingDrawing" xmlns:wp="http://schemas.openxmlformats.org/drawingml/2006/wordprocessingDrawing" xmlns:w10="urn:schemas-microsoft-com:office:word" xmlns:w="http://schemas.openxmlformats.org/wordprocessingml/2006/main" xmlns:w14="http://schemas.microsoft.com/office/word/2010/wordml" xmlns:w15="http://schemas.microsoft.com/office/word/2012/wordml" xmlns:w16cex="http://schemas.microsoft.com/office/word/2018/wordml/cex" xmlns:w16cid="http://schemas.microsoft.com/office/word/2016/wordml/cid" xmlns:w16="http://schemas.microsoft.com/office/word/2018/wordml" xmlns:w16du="http://schemas.microsoft.com/office/word/2023/wordml/word16du" xmlns:w16sdtdh="http://schemas.microsoft.com/office/word/2020/wordml/sdtdatahash" xmlns:w16sdtfl="http://schemas.microsoft.com/office/word/2024/wordml/sdtformatlock" xmlns:w16se="http://schemas.microsoft.com/office/word/2015/wordml/symex" xmlns:wpg="http://schemas.microsoft.com/office/word/2010/wordprocessingGroup" xmlns:wpi="http://schemas.microsoft.com/office/word/2010/wordprocessingInk" xmlns:wne="http://schemas.microsoft.com/office/word/2006/wordml" xmlns:wps="http://schemas.microsoft.com/office/word/2010/wordprocessingShape" mc:Ignorable="w14 w15 w16se w16cid w16 w16cex w16sdtdh w16sdtfl w16du wp14">
-  <w15:commentEx w15:paraId="6C801EEE" w15:done="0"/>
-  <w15:commentEx w15:paraId="6DA35899" w15:done="0"/>
-</w15:commentsEx>
-</file>
-
-<file path=word/commentsExtensible.xml><?xml version="1.0" encoding="utf-8"?>
-<w16cex:commentsExtensible xmlns:wpc="http://schemas.microsoft.com/office/word/2010/wordprocessingCanvas" xmlns:cx="http://schemas.microsoft.com/office/drawing/2014/chartex" xmlns:cx1="http://schemas.microsoft.com/office/drawing/2015/9/8/chartex" xmlns:cx2="http://schemas.microsoft.com/office/drawing/2015/10/21/chartex" xmlns:cx3="http://schemas.microsoft.com/office/drawing/2016/5/9/chartex" xmlns:cx4="http://schemas.microsoft.com/office/drawing/2016/5/10/chartex" xmlns:cx5="http://schemas.microsoft.com/office/drawing/2016/5/11/chartex" xmlns:cx6="http://schemas.microsoft.com/office/drawing/2016/5/12/chartex" xmlns:cx7="http://schemas.microsoft.com/office/drawing/2016/5/13/chartex" xmlns:cx8="http://schemas.microsoft.com/office/drawing/2016/5/14/chartex" xmlns:cr="http://schemas.microsoft.com/office/comments/2020/reactions" xmlns:mc="http://schemas.openxmlformats.org/markup-compatibility/2006" xmlns:aink="http://schemas.microsoft.com/office/drawing/2016/ink" xmlns:am3d="http://schemas.microsoft.com/office/drawing/2017/model3d" xmlns:o="urn:schemas-microsoft-com:office:office" xmlns:oel="http://schemas.microsoft.com/office/2019/extlst" xmlns:r="http://schemas.openxmlformats.org/officeDocument/2006/relationships" xmlns:m="http://schemas.openxmlformats.org/officeDocument/2006/math" xmlns:v="urn:schemas-microsoft-com:vml" xmlns:wp14="http://schemas.microsoft.com/office/word/2010/wordprocessingDrawing" xmlns:wp="http://schemas.openxmlformats.org/drawingml/2006/wordprocessingDrawing" xmlns:w10="urn:schemas-microsoft-com:office:word" xmlns:w="http://schemas.openxmlformats.org/wordprocessingml/2006/main" xmlns:w14="http://schemas.microsoft.com/office/word/2010/wordml" xmlns:w15="http://schemas.microsoft.com/office/word/2012/wordml" xmlns:w16cex="http://schemas.microsoft.com/office/word/2018/wordml/cex" xmlns:w16cid="http://schemas.microsoft.com/office/word/2016/wordml/cid" xmlns:w16="http://schemas.microsoft.com/office/word/2018/wordml" xmlns:w16du="http://schemas.microsoft.com/office/word/2023/wordml/word16du" xmlns:w16sdtdh="http://schemas.microsoft.com/office/word/2020/wordml/sdtdatahash" xmlns:w16sdtfl="http://schemas.microsoft.com/office/word/2024/wordml/sdtformatlock" xmlns:w16se="http://schemas.microsoft.com/office/word/2015/wordml/symex" xmlns:wpg="http://schemas.microsoft.com/office/word/2010/wordprocessingGroup" xmlns:wpi="http://schemas.microsoft.com/office/word/2010/wordprocessingInk" xmlns:wne="http://schemas.microsoft.com/office/word/2006/wordml" xmlns:wps="http://schemas.microsoft.com/office/word/2010/wordprocessingShape" mc:Ignorable="w14 w15 w16se w16cid w16 w16cex w16sdtdh w16sdtfl cr w16du wp14">
-  <w16cex:commentExtensible w16cex:durableId="3491DB94" w16cex:dateUtc="2026-06-03T16:13:00Z"/>
-  <w16cex:commentExtensible w16cex:durableId="3FC36308" w16cex:dateUtc="2026-06-03T16:13:00Z"/>
-</w16cex:commentsExtensible>
-</file>
-
-<file path=word/commentsIds.xml><?xml version="1.0" encoding="utf-8"?>
-<w16cid:commentsIds xmlns:wpc="http://schemas.microsoft.com/office/word/2010/wordprocessingCanvas" xmlns:cx="http://schemas.microsoft.com/office/drawing/2014/chartex" xmlns:cx1="http://schemas.microsoft.com/office/drawing/2015/9/8/chartex" xmlns:cx2="http://schemas.microsoft.com/office/drawing/2015/10/21/chartex" xmlns:cx3="http://schemas.microsoft.com/office/drawing/2016/5/9/chartex" xmlns:cx4="http://schemas.microsoft.com/office/drawing/2016/5/10/chartex" xmlns:cx5="http://schemas.microsoft.com/office/drawing/2016/5/11/chartex" xmlns:cx6="http://schemas.microsoft.com/office/drawing/2016/5/12/chartex" xmlns:cx7="http://schemas.microsoft.com/office/drawing/2016/5/13/chartex" xmlns:cx8="http://schemas.microsoft.com/office/drawing/2016/5/14/chartex" xmlns:mc="http://schemas.openxmlformats.org/markup-compatibility/2006" xmlns:aink="http://schemas.microsoft.com/office/drawing/2016/ink" xmlns:am3d="http://schemas.microsoft.com/office/drawing/2017/model3d" xmlns:o="urn:schemas-microsoft-com:office:office" xmlns:oel="http://schemas.microsoft.com/office/2019/extlst" xmlns:r="http://schemas.openxmlformats.org/officeDocument/2006/relationships" xmlns:m="http://schemas.openxmlformats.org/officeDocument/2006/math" xmlns:v="urn:schemas-microsoft-com:vml" xmlns:wp14="http://schemas.microsoft.com/office/word/2010/wordprocessingDrawing" xmlns:wp="http://schemas.openxmlformats.org/drawingml/2006/wordprocessingDrawing" xmlns:w10="urn:schemas-microsoft-com:office:word" xmlns:w="http://schemas.openxmlformats.org/wordprocessingml/2006/main" xmlns:w14="http://schemas.microsoft.com/office/word/2010/wordml" xmlns:w15="http://schemas.microsoft.com/office/word/2012/wordml" xmlns:w16cex="http://schemas.microsoft.com/office/word/2018/wordml/cex" xmlns:w16cid="http://schemas.microsoft.com/office/word/2016/wordml/cid" xmlns:w16="http://schemas.microsoft.com/office/word/2018/wordml" xmlns:w16du="http://schemas.microsoft.com/office/word/2023/wordml/word16du" xmlns:w16sdtdh="http://schemas.microsoft.com/office/word/2020/wordml/sdtdatahash" xmlns:w16sdtfl="http://schemas.microsoft.com/office/word/2024/wordml/sdtformatlock" xmlns:w16se="http://schemas.microsoft.com/office/word/2015/wordml/symex" xmlns:wpg="http://schemas.microsoft.com/office/word/2010/wordprocessingGroup" xmlns:wpi="http://schemas.microsoft.com/office/word/2010/wordprocessingInk" xmlns:wne="http://schemas.microsoft.com/office/word/2006/wordml" xmlns:wps="http://schemas.microsoft.com/office/word/2010/wordprocessingShape" mc:Ignorable="w14 w15 w16se w16cid w16 w16cex w16sdtdh w16sdtfl w16du wp14">
-  <w16cid:commentId w16cid:paraId="6C801EEE" w16cid:durableId="3491DB94"/>
-  <w16cid:commentId w16cid:paraId="6DA35899" w16cid:durableId="3FC36308"/>
-</w16cid:commentsIds>
 </file>
 
 <file path=word/endnotes.xml><?xml version="1.0" encoding="utf-8"?>
@@ -6863,14 +7209,6 @@
     <w:abstractNumId w:val="0"/>
   </w:num>
 </w:numbering>
-</file>
-
-<file path=word/people.xml><?xml version="1.0" encoding="utf-8"?>
-<w15:people xmlns:wpc="http://schemas.microsoft.com/office/word/2010/wordprocessingCanvas" xmlns:cx="http://schemas.microsoft.com/office/drawing/2014/chartex" xmlns:cx1="http://schemas.microsoft.com/office/drawing/2015/9/8/chartex" xmlns:cx2="http://schemas.microsoft.com/office/drawing/2015/10/21/chartex" xmlns:cx3="http://schemas.microsoft.com/office/drawing/2016/5/9/chartex" xmlns:cx4="http://schemas.microsoft.com/office/drawing/2016/5/10/chartex" xmlns:cx5="http://schemas.microsoft.com/office/drawing/2016/5/11/chartex" xmlns:cx6="http://schemas.microsoft.com/office/drawing/2016/5/12/chartex" xmlns:cx7="http://schemas.microsoft.com/office/drawing/2016/5/13/chartex" xmlns:cx8="http://schemas.microsoft.com/office/drawing/2016/5/14/chartex" xmlns:mc="http://schemas.openxmlformats.org/markup-compatibility/2006" xmlns:aink="http://schemas.microsoft.com/office/drawing/2016/ink" xmlns:am3d="http://schemas.microsoft.com/office/drawing/2017/model3d" xmlns:o="urn:schemas-microsoft-com:office:office" xmlns:oel="http://schemas.microsoft.com/office/2019/extlst" xmlns:r="http://schemas.openxmlformats.org/officeDocument/2006/relationships" xmlns:m="http://schemas.openxmlformats.org/officeDocument/2006/math" xmlns:v="urn:schemas-microsoft-com:vml" xmlns:wp14="http://schemas.microsoft.com/office/word/2010/wordprocessingDrawing" xmlns:wp="http://schemas.openxmlformats.org/drawingml/2006/wordprocessingDrawing" xmlns:w10="urn:schemas-microsoft-com:office:word" xmlns:w="http://schemas.openxmlformats.org/wordprocessingml/2006/main" xmlns:w14="http://schemas.microsoft.com/office/word/2010/wordml" xmlns:w15="http://schemas.microsoft.com/office/word/2012/wordml" xmlns:w16cex="http://schemas.microsoft.com/office/word/2018/wordml/cex" xmlns:w16cid="http://schemas.microsoft.com/office/word/2016/wordml/cid" xmlns:w16="http://schemas.microsoft.com/office/word/2018/wordml" xmlns:w16du="http://schemas.microsoft.com/office/word/2023/wordml/word16du" xmlns:w16sdtdh="http://schemas.microsoft.com/office/word/2020/wordml/sdtdatahash" xmlns:w16sdtfl="http://schemas.microsoft.com/office/word/2024/wordml/sdtformatlock" xmlns:w16se="http://schemas.microsoft.com/office/word/2015/wordml/symex" xmlns:wpg="http://schemas.microsoft.com/office/word/2010/wordprocessingGroup" xmlns:wpi="http://schemas.microsoft.com/office/word/2010/wordprocessingInk" xmlns:wne="http://schemas.microsoft.com/office/word/2006/wordml" xmlns:wps="http://schemas.microsoft.com/office/word/2010/wordprocessingShape" mc:Ignorable="w14 w15 w16se w16cid w16 w16cex w16sdtdh w16sdtfl w16du wp14">
-  <w15:person w15:author="SHANITA MIMSIIMA MUGIMBI">
-    <w15:presenceInfo w15:providerId="AD" w15:userId="S::221049640@student.uj.ac.za::8b8b455c-1aa9-4c35-b17d-175efcee2457"/>
-  </w15:person>
-</w15:people>
 </file>
 
 <file path=word/styles.xml><?xml version="1.0" encoding="utf-8"?>

</xml_diff>

<commit_message>
feat: add technical design documentation for team members
</commit_message>
<xml_diff>
--- a/Project Diagrams & Documents/QueueWatch_SA_Technical_Design_Documentation.docx
+++ b/Project Diagrams & Documents/QueueWatch_SA_Technical_Design_Documentation.docx
@@ -145,6 +145,16 @@
       </w:r>
       <w:r>
         <w:t>225003137</w:t>
+      </w:r>
+      <w:r>
+        <w:t>)</w:t>
+      </w:r>
+      <w:r>
+        <w:br/>
+        <w:t>Sbusiso Qagana (</w:t>
+      </w:r>
+      <w:r>
+        <w:t>223011367</w:t>
       </w:r>
       <w:r>
         <w:t>)</w:t>
@@ -3514,10 +3524,7 @@
         <w:t>Goal:</w:t>
       </w:r>
       <w:r>
-        <w:t xml:space="preserve"> The</w:t>
-      </w:r>
-      <w:r>
-        <w:t xml:space="preserve"> actor filters regional facilities on the platform to verify if their intended destination is heavily congested.</w:t>
+        <w:t xml:space="preserve"> The actor filters regional facilities on the platform to verify if their intended destination is heavily congested.</w:t>
       </w:r>
     </w:p>
     <w:p>
@@ -3602,10 +3609,7 @@
         <w:t>Goal:</w:t>
       </w:r>
       <w:r>
-        <w:t xml:space="preserve"> To</w:t>
-      </w:r>
-      <w:r>
-        <w:t xml:space="preserve"> publish active crowd conditions at a specific branch.</w:t>
+        <w:t xml:space="preserve"> To publish active crowd conditions at a specific branch.</w:t>
       </w:r>
     </w:p>
     <w:p>
@@ -3691,10 +3695,7 @@
         <w:t>Goal:</w:t>
       </w:r>
       <w:r>
-        <w:t xml:space="preserve"> To</w:t>
-      </w:r>
-      <w:r>
-        <w:t xml:space="preserve"> purge malicious data and clean the reporting metrics.</w:t>
+        <w:t xml:space="preserve"> To purge malicious data and clean the reporting metrics.</w:t>
       </w:r>
     </w:p>
     <w:p>
@@ -7818,7 +7819,6 @@
   <w:style w:type="character" w:default="1" w:styleId="DefaultParagraphFont">
     <w:name w:val="Default Paragraph Font"/>
     <w:uiPriority w:val="1"/>
-    <w:semiHidden/>
     <w:unhideWhenUsed/>
   </w:style>
   <w:style w:type="table" w:default="1" w:styleId="TableNormal">

</xml_diff>